<commit_message>
Add GVHD name (TS. Vu Anh Tuấn) to report cover
</commit_message>
<xml_diff>
--- a/Vietbaocao/Devops_bao_cao_NguyenDanhTai_102374.docx
+++ b/Vietbaocao/Devops_bao_cao_NguyenDanhTai_102374.docx
@@ -11,7 +11,7 @@
           <w:noProof/>
         </w:rPr>
         <w:drawing>
-          <wp:inline distT="0" distB="0" distL="0" distR="0" wp14:anchorId="46C11C49" wp14:editId="7966ED97">
+          <wp:inline distT="0" distB="0" distL="0" distR="0" wp14:anchorId="59703E97" wp14:editId="421E0D22">
             <wp:extent cx="4320000" cy="1803600"/>
             <wp:effectExtent l="0" t="0" r="0" b="0"/>
             <wp:docPr id="1" name="Picture 1"/>
@@ -152,7 +152,7 @@
         <w:rPr>
           <w:color w:val="000000"/>
         </w:rPr>
-        <w:t>GVHD: TS. ..............................</w:t>
+        <w:t>GVHD: TS. Vũ Anh Tuấn</w:t>
       </w:r>
     </w:p>
     <w:p>
@@ -234,7 +234,7 @@
       <w:r>
         <w:fldChar w:fldCharType="separate"/>
       </w:r>
-      <w:hyperlink w:anchor="_Toc243091268" w:history="1">
+      <w:hyperlink w:anchor="_Toc243091444" w:history="1">
         <w:r>
           <w:rPr>
             <w:rStyle w:val="Siuktni"/>
@@ -261,7 +261,7 @@
             <w:noProof/>
             <w:webHidden/>
           </w:rPr>
-          <w:instrText xml:space="preserve"> PAGEREF _Toc243091268 \h </w:instrText>
+          <w:instrText xml:space="preserve"> PAGEREF _Toc243091444 \h </w:instrText>
         </w:r>
         <w:r>
           <w:rPr>
@@ -307,7 +307,7 @@
           <w14:ligatures w14:val="standardContextual"/>
         </w:rPr>
       </w:pPr>
-      <w:hyperlink w:anchor="_Toc243091269" w:history="1">
+      <w:hyperlink w:anchor="_Toc243091445" w:history="1">
         <w:r>
           <w:rPr>
             <w:rStyle w:val="Siuktni"/>
@@ -334,7 +334,7 @@
             <w:noProof/>
             <w:webHidden/>
           </w:rPr>
-          <w:instrText xml:space="preserve"> PAGEREF _Toc243091269 \h </w:instrText>
+          <w:instrText xml:space="preserve"> PAGEREF _Toc243091445 \h </w:instrText>
         </w:r>
         <w:r>
           <w:rPr>
@@ -380,7 +380,7 @@
           <w14:ligatures w14:val="standardContextual"/>
         </w:rPr>
       </w:pPr>
-      <w:hyperlink w:anchor="_Toc243091270" w:history="1">
+      <w:hyperlink w:anchor="_Toc243091446" w:history="1">
         <w:r>
           <w:rPr>
             <w:rStyle w:val="Siuktni"/>
@@ -407,7 +407,7 @@
             <w:noProof/>
             <w:webHidden/>
           </w:rPr>
-          <w:instrText xml:space="preserve"> PAGEREF _Toc243091270 \h </w:instrText>
+          <w:instrText xml:space="preserve"> PAGEREF _Toc243091446 \h </w:instrText>
         </w:r>
         <w:r>
           <w:rPr>
@@ -453,7 +453,7 @@
           <w14:ligatures w14:val="standardContextual"/>
         </w:rPr>
       </w:pPr>
-      <w:hyperlink w:anchor="_Toc243091271" w:history="1">
+      <w:hyperlink w:anchor="_Toc243091447" w:history="1">
         <w:r>
           <w:rPr>
             <w:rStyle w:val="Siuktni"/>
@@ -480,7 +480,7 @@
             <w:noProof/>
             <w:webHidden/>
           </w:rPr>
-          <w:instrText xml:space="preserve"> PAGEREF _Toc243091271 \h </w:instrText>
+          <w:instrText xml:space="preserve"> PAGEREF _Toc243091447 \h </w:instrText>
         </w:r>
         <w:r>
           <w:rPr>
@@ -526,7 +526,7 @@
           <w14:ligatures w14:val="standardContextual"/>
         </w:rPr>
       </w:pPr>
-      <w:hyperlink w:anchor="_Toc243091272" w:history="1">
+      <w:hyperlink w:anchor="_Toc243091448" w:history="1">
         <w:r>
           <w:rPr>
             <w:rStyle w:val="Siuktni"/>
@@ -553,7 +553,7 @@
             <w:noProof/>
             <w:webHidden/>
           </w:rPr>
-          <w:instrText xml:space="preserve"> PAGEREF _Toc243091272 \h </w:instrText>
+          <w:instrText xml:space="preserve"> PAGEREF _Toc243091448 \h </w:instrText>
         </w:r>
         <w:r>
           <w:rPr>
@@ -599,7 +599,7 @@
           <w14:ligatures w14:val="standardContextual"/>
         </w:rPr>
       </w:pPr>
-      <w:hyperlink w:anchor="_Toc243091273" w:history="1">
+      <w:hyperlink w:anchor="_Toc243091449" w:history="1">
         <w:r>
           <w:rPr>
             <w:rStyle w:val="Siuktni"/>
@@ -626,7 +626,7 @@
             <w:noProof/>
             <w:webHidden/>
           </w:rPr>
-          <w:instrText xml:space="preserve"> PAGEREF _Toc243091273 \h </w:instrText>
+          <w:instrText xml:space="preserve"> PAGEREF _Toc243091449 \h </w:instrText>
         </w:r>
         <w:r>
           <w:rPr>
@@ -672,7 +672,7 @@
           <w14:ligatures w14:val="standardContextual"/>
         </w:rPr>
       </w:pPr>
-      <w:hyperlink w:anchor="_Toc243091274" w:history="1">
+      <w:hyperlink w:anchor="_Toc243091450" w:history="1">
         <w:r>
           <w:rPr>
             <w:rStyle w:val="Siuktni"/>
@@ -699,7 +699,7 @@
             <w:noProof/>
             <w:webHidden/>
           </w:rPr>
-          <w:instrText xml:space="preserve"> PAGEREF _Toc243091274 \h </w:instrText>
+          <w:instrText xml:space="preserve"> PAGEREF _Toc243091450 \h </w:instrText>
         </w:r>
         <w:r>
           <w:rPr>
@@ -745,7 +745,7 @@
           <w14:ligatures w14:val="standardContextual"/>
         </w:rPr>
       </w:pPr>
-      <w:hyperlink w:anchor="_Toc243091275" w:history="1">
+      <w:hyperlink w:anchor="_Toc243091451" w:history="1">
         <w:r>
           <w:rPr>
             <w:rStyle w:val="Siuktni"/>
@@ -772,7 +772,7 @@
             <w:noProof/>
             <w:webHidden/>
           </w:rPr>
-          <w:instrText xml:space="preserve"> PAGEREF _Toc243091275 \h </w:instrText>
+          <w:instrText xml:space="preserve"> PAGEREF _Toc243091451 \h </w:instrText>
         </w:r>
         <w:r>
           <w:rPr>
@@ -818,7 +818,7 @@
           <w14:ligatures w14:val="standardContextual"/>
         </w:rPr>
       </w:pPr>
-      <w:hyperlink w:anchor="_Toc243091276" w:history="1">
+      <w:hyperlink w:anchor="_Toc243091452" w:history="1">
         <w:r>
           <w:rPr>
             <w:rStyle w:val="Siuktni"/>
@@ -845,7 +845,7 @@
             <w:noProof/>
             <w:webHidden/>
           </w:rPr>
-          <w:instrText xml:space="preserve"> PAGEREF _Toc243091276 \h </w:instrText>
+          <w:instrText xml:space="preserve"> PAGEREF _Toc243091452 \h </w:instrText>
         </w:r>
         <w:r>
           <w:rPr>
@@ -891,7 +891,7 @@
           <w14:ligatures w14:val="standardContextual"/>
         </w:rPr>
       </w:pPr>
-      <w:hyperlink w:anchor="_Toc243091277" w:history="1">
+      <w:hyperlink w:anchor="_Toc243091453" w:history="1">
         <w:r>
           <w:rPr>
             <w:rStyle w:val="Siuktni"/>
@@ -918,7 +918,7 @@
             <w:noProof/>
             <w:webHidden/>
           </w:rPr>
-          <w:instrText xml:space="preserve"> PAGEREF _Toc243091277 \h </w:instrText>
+          <w:instrText xml:space="preserve"> PAGEREF _Toc243091453 \h </w:instrText>
         </w:r>
         <w:r>
           <w:rPr>
@@ -964,7 +964,7 @@
           <w14:ligatures w14:val="standardContextual"/>
         </w:rPr>
       </w:pPr>
-      <w:hyperlink w:anchor="_Toc243091278" w:history="1">
+      <w:hyperlink w:anchor="_Toc243091454" w:history="1">
         <w:r>
           <w:rPr>
             <w:rStyle w:val="Siuktni"/>
@@ -991,7 +991,7 @@
             <w:noProof/>
             <w:webHidden/>
           </w:rPr>
-          <w:instrText xml:space="preserve"> PAGEREF _Toc243091278 \h </w:instrText>
+          <w:instrText xml:space="preserve"> PAGEREF _Toc243091454 \h </w:instrText>
         </w:r>
         <w:r>
           <w:rPr>
@@ -1037,7 +1037,7 @@
           <w14:ligatures w14:val="standardContextual"/>
         </w:rPr>
       </w:pPr>
-      <w:hyperlink w:anchor="_Toc243091279" w:history="1">
+      <w:hyperlink w:anchor="_Toc243091455" w:history="1">
         <w:r>
           <w:rPr>
             <w:rStyle w:val="Siuktni"/>
@@ -1064,7 +1064,7 @@
             <w:noProof/>
             <w:webHidden/>
           </w:rPr>
-          <w:instrText xml:space="preserve"> PAGEREF _Toc243091279 \h </w:instrText>
+          <w:instrText xml:space="preserve"> PAGEREF _Toc243091455 \h </w:instrText>
         </w:r>
         <w:r>
           <w:rPr>
@@ -1110,7 +1110,7 @@
           <w14:ligatures w14:val="standardContextual"/>
         </w:rPr>
       </w:pPr>
-      <w:hyperlink w:anchor="_Toc243091280" w:history="1">
+      <w:hyperlink w:anchor="_Toc243091456" w:history="1">
         <w:r>
           <w:rPr>
             <w:rStyle w:val="Siuktni"/>
@@ -1137,7 +1137,7 @@
             <w:noProof/>
             <w:webHidden/>
           </w:rPr>
-          <w:instrText xml:space="preserve"> PAGEREF _Toc243091280 \h </w:instrText>
+          <w:instrText xml:space="preserve"> PAGEREF _Toc243091456 \h </w:instrText>
         </w:r>
         <w:r>
           <w:rPr>
@@ -1183,7 +1183,7 @@
           <w14:ligatures w14:val="standardContextual"/>
         </w:rPr>
       </w:pPr>
-      <w:hyperlink w:anchor="_Toc243091281" w:history="1">
+      <w:hyperlink w:anchor="_Toc243091457" w:history="1">
         <w:r>
           <w:rPr>
             <w:rStyle w:val="Siuktni"/>
@@ -1210,7 +1210,7 @@
             <w:noProof/>
             <w:webHidden/>
           </w:rPr>
-          <w:instrText xml:space="preserve"> PAGEREF _Toc243091281 \h </w:instrText>
+          <w:instrText xml:space="preserve"> PAGEREF _Toc243091457 \h </w:instrText>
         </w:r>
         <w:r>
           <w:rPr>
@@ -1256,7 +1256,7 @@
           <w14:ligatures w14:val="standardContextual"/>
         </w:rPr>
       </w:pPr>
-      <w:hyperlink w:anchor="_Toc243091282" w:history="1">
+      <w:hyperlink w:anchor="_Toc243091458" w:history="1">
         <w:r>
           <w:rPr>
             <w:rStyle w:val="Siuktni"/>
@@ -1283,7 +1283,7 @@
             <w:noProof/>
             <w:webHidden/>
           </w:rPr>
-          <w:instrText xml:space="preserve"> PAGEREF _Toc243091282 \h </w:instrText>
+          <w:instrText xml:space="preserve"> PAGEREF _Toc243091458 \h </w:instrText>
         </w:r>
         <w:r>
           <w:rPr>
@@ -1329,7 +1329,7 @@
           <w14:ligatures w14:val="standardContextual"/>
         </w:rPr>
       </w:pPr>
-      <w:hyperlink w:anchor="_Toc243091283" w:history="1">
+      <w:hyperlink w:anchor="_Toc243091459" w:history="1">
         <w:r>
           <w:rPr>
             <w:rStyle w:val="Siuktni"/>
@@ -1356,7 +1356,7 @@
             <w:noProof/>
             <w:webHidden/>
           </w:rPr>
-          <w:instrText xml:space="preserve"> PAGEREF _Toc243091283 \h </w:instrText>
+          <w:instrText xml:space="preserve"> PAGEREF _Toc243091459 \h </w:instrText>
         </w:r>
         <w:r>
           <w:rPr>
@@ -1402,7 +1402,7 @@
           <w14:ligatures w14:val="standardContextual"/>
         </w:rPr>
       </w:pPr>
-      <w:hyperlink w:anchor="_Toc243091284" w:history="1">
+      <w:hyperlink w:anchor="_Toc243091460" w:history="1">
         <w:r>
           <w:rPr>
             <w:rStyle w:val="Siuktni"/>
@@ -1429,7 +1429,7 @@
             <w:noProof/>
             <w:webHidden/>
           </w:rPr>
-          <w:instrText xml:space="preserve"> PAGEREF _Toc243091284 \h </w:instrText>
+          <w:instrText xml:space="preserve"> PAGEREF _Toc243091460 \h </w:instrText>
         </w:r>
         <w:r>
           <w:rPr>
@@ -1475,7 +1475,7 @@
           <w14:ligatures w14:val="standardContextual"/>
         </w:rPr>
       </w:pPr>
-      <w:hyperlink w:anchor="_Toc243091285" w:history="1">
+      <w:hyperlink w:anchor="_Toc243091461" w:history="1">
         <w:r>
           <w:rPr>
             <w:rStyle w:val="Siuktni"/>
@@ -1502,7 +1502,7 @@
             <w:noProof/>
             <w:webHidden/>
           </w:rPr>
-          <w:instrText xml:space="preserve"> PAGEREF _Toc243091285 \h </w:instrText>
+          <w:instrText xml:space="preserve"> PAGEREF _Toc243091461 \h </w:instrText>
         </w:r>
         <w:r>
           <w:rPr>
@@ -1548,7 +1548,7 @@
           <w14:ligatures w14:val="standardContextual"/>
         </w:rPr>
       </w:pPr>
-      <w:hyperlink w:anchor="_Toc243091286" w:history="1">
+      <w:hyperlink w:anchor="_Toc243091462" w:history="1">
         <w:r>
           <w:rPr>
             <w:rStyle w:val="Siuktni"/>
@@ -1575,7 +1575,7 @@
             <w:noProof/>
             <w:webHidden/>
           </w:rPr>
-          <w:instrText xml:space="preserve"> PAGEREF _Toc243091286 \h </w:instrText>
+          <w:instrText xml:space="preserve"> PAGEREF _Toc243091462 \h </w:instrText>
         </w:r>
         <w:r>
           <w:rPr>
@@ -1621,7 +1621,7 @@
           <w14:ligatures w14:val="standardContextual"/>
         </w:rPr>
       </w:pPr>
-      <w:hyperlink w:anchor="_Toc243091287" w:history="1">
+      <w:hyperlink w:anchor="_Toc243091463" w:history="1">
         <w:r>
           <w:rPr>
             <w:rStyle w:val="Siuktni"/>
@@ -1648,7 +1648,7 @@
             <w:noProof/>
             <w:webHidden/>
           </w:rPr>
-          <w:instrText xml:space="preserve"> PAGEREF _Toc243091287 \h </w:instrText>
+          <w:instrText xml:space="preserve"> PAGEREF _Toc243091463 \h </w:instrText>
         </w:r>
         <w:r>
           <w:rPr>
@@ -1694,7 +1694,7 @@
           <w14:ligatures w14:val="standardContextual"/>
         </w:rPr>
       </w:pPr>
-      <w:hyperlink w:anchor="_Toc243091288" w:history="1">
+      <w:hyperlink w:anchor="_Toc243091464" w:history="1">
         <w:r>
           <w:rPr>
             <w:rStyle w:val="Siuktni"/>
@@ -1721,7 +1721,7 @@
             <w:noProof/>
             <w:webHidden/>
           </w:rPr>
-          <w:instrText xml:space="preserve"> PAGEREF _Toc243091288 \h </w:instrText>
+          <w:instrText xml:space="preserve"> PAGEREF _Toc243091464 \h </w:instrText>
         </w:r>
         <w:r>
           <w:rPr>
@@ -1767,7 +1767,7 @@
           <w14:ligatures w14:val="standardContextual"/>
         </w:rPr>
       </w:pPr>
-      <w:hyperlink w:anchor="_Toc243091289" w:history="1">
+      <w:hyperlink w:anchor="_Toc243091465" w:history="1">
         <w:r>
           <w:rPr>
             <w:rStyle w:val="Siuktni"/>
@@ -1794,7 +1794,7 @@
             <w:noProof/>
             <w:webHidden/>
           </w:rPr>
-          <w:instrText xml:space="preserve"> PAGEREF _Toc243091289 \h </w:instrText>
+          <w:instrText xml:space="preserve"> PAGEREF _Toc243091465 \h </w:instrText>
         </w:r>
         <w:r>
           <w:rPr>
@@ -1874,7 +1874,7 @@
       <w:r>
         <w:fldChar w:fldCharType="separate"/>
       </w:r>
-      <w:hyperlink w:anchor="_Toc243091290" w:history="1">
+      <w:hyperlink w:anchor="_Toc243091466" w:history="1">
         <w:r>
           <w:rPr>
             <w:rStyle w:val="Siuktni"/>
@@ -1901,7 +1901,7 @@
             <w:noProof/>
             <w:webHidden/>
           </w:rPr>
-          <w:instrText xml:space="preserve"> PAGEREF _Toc243091290 \h </w:instrText>
+          <w:instrText xml:space="preserve"> PAGEREF _Toc243091466 \h </w:instrText>
         </w:r>
         <w:r>
           <w:rPr>
@@ -1947,7 +1947,7 @@
           <w14:ligatures w14:val="standardContextual"/>
         </w:rPr>
       </w:pPr>
-      <w:hyperlink w:anchor="_Toc243091291" w:history="1">
+      <w:hyperlink w:anchor="_Toc243091467" w:history="1">
         <w:r>
           <w:rPr>
             <w:rStyle w:val="Siuktni"/>
@@ -1974,7 +1974,7 @@
             <w:noProof/>
             <w:webHidden/>
           </w:rPr>
-          <w:instrText xml:space="preserve"> PAGEREF _Toc243091291 \h </w:instrText>
+          <w:instrText xml:space="preserve"> PAGEREF _Toc243091467 \h </w:instrText>
         </w:r>
         <w:r>
           <w:rPr>
@@ -2020,7 +2020,7 @@
           <w14:ligatures w14:val="standardContextual"/>
         </w:rPr>
       </w:pPr>
-      <w:hyperlink w:anchor="_Toc243091292" w:history="1">
+      <w:hyperlink w:anchor="_Toc243091468" w:history="1">
         <w:r>
           <w:rPr>
             <w:rStyle w:val="Siuktni"/>
@@ -2047,7 +2047,7 @@
             <w:noProof/>
             <w:webHidden/>
           </w:rPr>
-          <w:instrText xml:space="preserve"> PAGEREF _Toc243091292 \h </w:instrText>
+          <w:instrText xml:space="preserve"> PAGEREF _Toc243091468 \h </w:instrText>
         </w:r>
         <w:r>
           <w:rPr>
@@ -2093,7 +2093,7 @@
           <w14:ligatures w14:val="standardContextual"/>
         </w:rPr>
       </w:pPr>
-      <w:hyperlink w:anchor="_Toc243091293" w:history="1">
+      <w:hyperlink w:anchor="_Toc243091469" w:history="1">
         <w:r>
           <w:rPr>
             <w:rStyle w:val="Siuktni"/>
@@ -2120,7 +2120,7 @@
             <w:noProof/>
             <w:webHidden/>
           </w:rPr>
-          <w:instrText xml:space="preserve"> PAGEREF _Toc243091293 \h </w:instrText>
+          <w:instrText xml:space="preserve"> PAGEREF _Toc243091469 \h </w:instrText>
         </w:r>
         <w:r>
           <w:rPr>
@@ -2166,7 +2166,7 @@
           <w14:ligatures w14:val="standardContextual"/>
         </w:rPr>
       </w:pPr>
-      <w:hyperlink w:anchor="_Toc243091294" w:history="1">
+      <w:hyperlink w:anchor="_Toc243091470" w:history="1">
         <w:r>
           <w:rPr>
             <w:rStyle w:val="Siuktni"/>
@@ -2193,7 +2193,7 @@
             <w:noProof/>
             <w:webHidden/>
           </w:rPr>
-          <w:instrText xml:space="preserve"> PAGEREF _Toc243091294 \h </w:instrText>
+          <w:instrText xml:space="preserve"> PAGEREF _Toc243091470 \h </w:instrText>
         </w:r>
         <w:r>
           <w:rPr>
@@ -2239,7 +2239,7 @@
           <w14:ligatures w14:val="standardContextual"/>
         </w:rPr>
       </w:pPr>
-      <w:hyperlink w:anchor="_Toc243091295" w:history="1">
+      <w:hyperlink w:anchor="_Toc243091471" w:history="1">
         <w:r>
           <w:rPr>
             <w:rStyle w:val="Siuktni"/>
@@ -2266,7 +2266,7 @@
             <w:noProof/>
             <w:webHidden/>
           </w:rPr>
-          <w:instrText xml:space="preserve"> PAGEREF _Toc243091295 \h </w:instrText>
+          <w:instrText xml:space="preserve"> PAGEREF _Toc243091471 \h </w:instrText>
         </w:r>
         <w:r>
           <w:rPr>
@@ -2306,7 +2306,7 @@
       <w:pPr>
         <w:pStyle w:val="u1"/>
       </w:pPr>
-      <w:bookmarkStart w:id="0" w:name="_Toc243091268"/>
+      <w:bookmarkStart w:id="0" w:name="_Toc243091444"/>
       <w:r>
         <w:lastRenderedPageBreak/>
         <w:t>CHƯƠNG 1. GI</w:t>
@@ -2329,7 +2329,7 @@
       <w:pPr>
         <w:pStyle w:val="u2"/>
       </w:pPr>
-      <w:bookmarkStart w:id="1" w:name="_Toc243091269"/>
+      <w:bookmarkStart w:id="1" w:name="_Toc243091445"/>
       <w:r>
         <w:t>1.1. B</w:t>
       </w:r>
@@ -2385,7 +2385,7 @@
       <w:pPr>
         <w:pStyle w:val="u2"/>
       </w:pPr>
-      <w:bookmarkStart w:id="2" w:name="_Toc243091270"/>
+      <w:bookmarkStart w:id="2" w:name="_Toc243091446"/>
       <w:r>
         <w:t>1.2. M</w:t>
       </w:r>
@@ -2464,7 +2464,7 @@
       <w:pPr>
         <w:pStyle w:val="u2"/>
       </w:pPr>
-      <w:bookmarkStart w:id="3" w:name="_Toc243091271"/>
+      <w:bookmarkStart w:id="3" w:name="_Toc243091447"/>
       <w:r>
         <w:t>1.3. Ph</w:t>
       </w:r>
@@ -2536,7 +2536,7 @@
       <w:pPr>
         <w:pStyle w:val="u1"/>
       </w:pPr>
-      <w:bookmarkStart w:id="4" w:name="_Toc243091272"/>
+      <w:bookmarkStart w:id="4" w:name="_Toc243091448"/>
       <w:r>
         <w:lastRenderedPageBreak/>
         <w:t>CHƯƠNG 2. CƠ S</w:t>
@@ -2559,7 +2559,7 @@
       <w:pPr>
         <w:pStyle w:val="u2"/>
       </w:pPr>
-      <w:bookmarkStart w:id="5" w:name="_Toc243091273"/>
+      <w:bookmarkStart w:id="5" w:name="_Toc243091449"/>
       <w:r>
         <w:t>2.1. DevOps và CI/CD</w:t>
       </w:r>
@@ -2591,7 +2591,7 @@
       <w:pPr>
         <w:pStyle w:val="u2"/>
       </w:pPr>
-      <w:bookmarkStart w:id="6" w:name="_Toc243091274"/>
+      <w:bookmarkStart w:id="6" w:name="_Toc243091450"/>
       <w:r>
         <w:t>2.2. WSL - Windows Subsystem for Linux</w:t>
       </w:r>
@@ -2615,7 +2615,7 @@
       <w:pPr>
         <w:pStyle w:val="u2"/>
       </w:pPr>
-      <w:bookmarkStart w:id="7" w:name="_Toc243091275"/>
+      <w:bookmarkStart w:id="7" w:name="_Toc243091451"/>
       <w:r>
         <w:t>2.3. SSH - Secure Shell</w:t>
       </w:r>
@@ -2633,7 +2633,7 @@
       <w:pPr>
         <w:pStyle w:val="u2"/>
       </w:pPr>
-      <w:bookmarkStart w:id="8" w:name="_Toc243091276"/>
+      <w:bookmarkStart w:id="8" w:name="_Toc243091452"/>
       <w:r>
         <w:t>2.4. Docker và container</w:t>
       </w:r>
@@ -2666,7 +2666,7 @@
       <w:pPr>
         <w:pStyle w:val="u2"/>
       </w:pPr>
-      <w:bookmarkStart w:id="9" w:name="_Toc243091277"/>
+      <w:bookmarkStart w:id="9" w:name="_Toc243091453"/>
       <w:r>
         <w:t>2.5. Jenkins</w:t>
       </w:r>
@@ -2690,7 +2690,7 @@
       <w:pPr>
         <w:pStyle w:val="u1"/>
       </w:pPr>
-      <w:bookmarkStart w:id="10" w:name="_Toc243091278"/>
+      <w:bookmarkStart w:id="10" w:name="_Toc243091454"/>
       <w:r>
         <w:lastRenderedPageBreak/>
         <w:t>CHƯƠNG 3. MÔI TRƯ</w:t>
@@ -3295,7 +3295,7 @@
       <w:pPr>
         <w:pStyle w:val="u1"/>
       </w:pPr>
-      <w:bookmarkStart w:id="11" w:name="_Toc243091279"/>
+      <w:bookmarkStart w:id="11" w:name="_Toc243091455"/>
       <w:r>
         <w:lastRenderedPageBreak/>
         <w:t>CHƯƠNG 4. TRI</w:t>
@@ -3324,7 +3324,7 @@
       <w:pPr>
         <w:pStyle w:val="u2"/>
       </w:pPr>
-      <w:bookmarkStart w:id="12" w:name="_Toc243091280"/>
+      <w:bookmarkStart w:id="12" w:name="_Toc243091456"/>
       <w:r>
         <w:t>4.1. T</w:t>
       </w:r>
@@ -3935,7 +3935,7 @@
         </w:rPr>
         <w:lastRenderedPageBreak/>
         <w:drawing>
-          <wp:inline distT="0" distB="0" distL="0" distR="0" wp14:anchorId="7CB5A839" wp14:editId="600381F9">
+          <wp:inline distT="0" distB="0" distL="0" distR="0" wp14:anchorId="15EAA8DF" wp14:editId="665D2C7B">
             <wp:extent cx="5220000" cy="2936250"/>
             <wp:effectExtent l="0" t="0" r="0" b="0"/>
             <wp:docPr id="2" name="Picture 2"/>
@@ -3977,7 +3977,7 @@
         <w:spacing w:after="160"/>
         <w:jc w:val="center"/>
       </w:pPr>
-      <w:bookmarkStart w:id="13" w:name="_Toc243091290"/>
+      <w:bookmarkStart w:id="13" w:name="_Toc243091466"/>
       <w:r>
         <w:t>Hình 4.1. Tạo docker-compose.yml và chạy docker compose up -d lần đầu</w:t>
       </w:r>
@@ -4002,7 +4002,7 @@
       <w:pPr>
         <w:pStyle w:val="u2"/>
       </w:pPr>
-      <w:bookmarkStart w:id="14" w:name="_Toc243091281"/>
+      <w:bookmarkStart w:id="14" w:name="_Toc243091457"/>
       <w:r>
         <w:t>4.2. Ki</w:t>
       </w:r>
@@ -4331,7 +4331,7 @@
           <w:noProof/>
         </w:rPr>
         <w:drawing>
-          <wp:inline distT="0" distB="0" distL="0" distR="0" wp14:anchorId="019E23A0" wp14:editId="2AC94F66">
+          <wp:inline distT="0" distB="0" distL="0" distR="0" wp14:anchorId="1F8050BD" wp14:editId="18A62546">
             <wp:extent cx="5220000" cy="2936250"/>
             <wp:effectExtent l="0" t="0" r="0" b="0"/>
             <wp:docPr id="3" name="Picture 3"/>
@@ -4373,7 +4373,7 @@
         <w:spacing w:after="160"/>
         <w:jc w:val="center"/>
       </w:pPr>
-      <w:bookmarkStart w:id="15" w:name="_Toc243091291"/>
+      <w:bookmarkStart w:id="15" w:name="_Toc243091467"/>
       <w:r>
         <w:t>Hình 4.2. Kiểm tra container, push image và build lại bằng docker compose up -d --build</w:t>
       </w:r>
@@ -4398,7 +4398,7 @@
       <w:pPr>
         <w:pStyle w:val="u2"/>
       </w:pPr>
-      <w:bookmarkStart w:id="16" w:name="_Toc243091282"/>
+      <w:bookmarkStart w:id="16" w:name="_Toc243091458"/>
       <w:r>
         <w:t>4.3. Hoàn t</w:t>
       </w:r>
@@ -4475,7 +4475,7 @@
           <w:noProof/>
         </w:rPr>
         <w:drawing>
-          <wp:inline distT="0" distB="0" distL="0" distR="0" wp14:anchorId="07F7BE39" wp14:editId="4649383B">
+          <wp:inline distT="0" distB="0" distL="0" distR="0" wp14:anchorId="38F0B443" wp14:editId="05405346">
             <wp:extent cx="5220000" cy="2936250"/>
             <wp:effectExtent l="0" t="0" r="0" b="0"/>
             <wp:docPr id="4" name="Picture 4"/>
@@ -4517,7 +4517,7 @@
         <w:spacing w:after="160"/>
         <w:jc w:val="center"/>
       </w:pPr>
-      <w:bookmarkStart w:id="17" w:name="_Toc243091292"/>
+      <w:bookmarkStart w:id="17" w:name="_Toc243091468"/>
       <w:r>
         <w:t>Hình 4.3. Hoàn tất build lại và push bản mới lên Docker Hub</w:t>
       </w:r>
@@ -4565,7 +4565,7 @@
           <w:noProof/>
         </w:rPr>
         <w:drawing>
-          <wp:inline distT="0" distB="0" distL="0" distR="0" wp14:anchorId="01FF1561" wp14:editId="31E3CF41">
+          <wp:inline distT="0" distB="0" distL="0" distR="0" wp14:anchorId="0FC74B3F" wp14:editId="6B9E66CF">
             <wp:extent cx="5220000" cy="2936250"/>
             <wp:effectExtent l="0" t="0" r="0" b="0"/>
             <wp:docPr id="5" name="Picture 5"/>
@@ -4607,7 +4607,7 @@
         <w:spacing w:after="160"/>
         <w:jc w:val="center"/>
       </w:pPr>
-      <w:bookmarkStart w:id="18" w:name="_Toc243091293"/>
+      <w:bookmarkStart w:id="18" w:name="_Toc243091469"/>
       <w:r>
         <w:t>Hình 4.4. Giao diện web tại localhost:8000 sau khi build lại</w:t>
       </w:r>
@@ -4623,7 +4623,7 @@
           <w:noProof/>
         </w:rPr>
         <w:drawing>
-          <wp:inline distT="0" distB="0" distL="0" distR="0" wp14:anchorId="0B92C01E" wp14:editId="17E0FEAA">
+          <wp:inline distT="0" distB="0" distL="0" distR="0" wp14:anchorId="36DAF282" wp14:editId="089640DE">
             <wp:extent cx="5220000" cy="2972102"/>
             <wp:effectExtent l="0" t="0" r="0" b="0"/>
             <wp:docPr id="6" name="Picture 6"/>
@@ -4665,7 +4665,7 @@
         <w:spacing w:after="160"/>
         <w:jc w:val="center"/>
       </w:pPr>
-      <w:bookmarkStart w:id="19" w:name="_Toc243091294"/>
+      <w:bookmarkStart w:id="19" w:name="_Toc243091470"/>
       <w:r>
         <w:t>Hình 4.5. Docker Desktop — danh sách container đang chạy</w:t>
       </w:r>
@@ -4930,7 +4930,7 @@
       <w:pPr>
         <w:pStyle w:val="u2"/>
       </w:pPr>
-      <w:bookmarkStart w:id="20" w:name="_Toc243091283"/>
+      <w:bookmarkStart w:id="20" w:name="_Toc243091459"/>
       <w:r>
         <w:t>4.4. Vi</w:t>
       </w:r>
@@ -5963,7 +5963,7 @@
           <w:noProof/>
         </w:rPr>
         <w:drawing>
-          <wp:inline distT="0" distB="0" distL="0" distR="0" wp14:anchorId="2D968957" wp14:editId="031F9052">
+          <wp:inline distT="0" distB="0" distL="0" distR="0" wp14:anchorId="07433DBF" wp14:editId="39A48B99">
             <wp:extent cx="4680000" cy="2510625"/>
             <wp:effectExtent l="0" t="0" r="0" b="0"/>
             <wp:docPr id="7" name="Picture 7"/>
@@ -6005,7 +6005,7 @@
         <w:spacing w:after="160"/>
         <w:jc w:val="center"/>
       </w:pPr>
-      <w:bookmarkStart w:id="21" w:name="_Toc243091295"/>
+      <w:bookmarkStart w:id="21" w:name="_Toc243091471"/>
       <w:r>
         <w:t>Hình 4.6. Kết quả Build #4 của job student-cicd trên Jenkins</w:t>
       </w:r>
@@ -6639,7 +6639,7 @@
       <w:pPr>
         <w:pStyle w:val="u1"/>
       </w:pPr>
-      <w:bookmarkStart w:id="22" w:name="_Toc243091284"/>
+      <w:bookmarkStart w:id="22" w:name="_Toc243091460"/>
       <w:r>
         <w:lastRenderedPageBreak/>
         <w:t>CHƯƠNG 5. ĐÁNH GIÁ VÀ K</w:t>
@@ -6662,7 +6662,7 @@
       <w:pPr>
         <w:pStyle w:val="u2"/>
       </w:pPr>
-      <w:bookmarkStart w:id="23" w:name="_Toc243091285"/>
+      <w:bookmarkStart w:id="23" w:name="_Toc243091461"/>
       <w:r>
         <w:t>5.1. K</w:t>
       </w:r>
@@ -7146,7 +7146,7 @@
       <w:pPr>
         <w:pStyle w:val="u2"/>
       </w:pPr>
-      <w:bookmarkStart w:id="24" w:name="_Toc243091286"/>
+      <w:bookmarkStart w:id="24" w:name="_Toc243091462"/>
       <w:r>
         <w:t>5.2. M</w:t>
       </w:r>
@@ -7283,7 +7283,7 @@
       <w:pPr>
         <w:pStyle w:val="u2"/>
       </w:pPr>
-      <w:bookmarkStart w:id="25" w:name="_Toc243091287"/>
+      <w:bookmarkStart w:id="25" w:name="_Toc243091463"/>
       <w:r>
         <w:t>5.3. Hư</w:t>
       </w:r>
@@ -7371,7 +7371,7 @@
       <w:pPr>
         <w:pStyle w:val="u2"/>
       </w:pPr>
-      <w:bookmarkStart w:id="26" w:name="_Toc243091288"/>
+      <w:bookmarkStart w:id="26" w:name="_Toc243091464"/>
       <w:r>
         <w:t>5.4. K</w:t>
       </w:r>
@@ -7409,7 +7409,7 @@
       <w:pPr>
         <w:pStyle w:val="u1"/>
       </w:pPr>
-      <w:bookmarkStart w:id="27" w:name="_Toc243091289"/>
+      <w:bookmarkStart w:id="27" w:name="_Toc243091465"/>
       <w:r>
         <w:lastRenderedPageBreak/>
         <w:t>TÀI LI</w:t>
@@ -7900,31 +7900,31 @@
       </w:rPr>
     </w:lvl>
   </w:abstractNum>
-  <w:num w:numId="1" w16cid:durableId="1862862423">
+  <w:num w:numId="1" w16cid:durableId="852189588">
     <w:abstractNumId w:val="8"/>
   </w:num>
-  <w:num w:numId="2" w16cid:durableId="1478765500">
+  <w:num w:numId="2" w16cid:durableId="1509979062">
     <w:abstractNumId w:val="6"/>
   </w:num>
-  <w:num w:numId="3" w16cid:durableId="547767609">
+  <w:num w:numId="3" w16cid:durableId="1234664406">
     <w:abstractNumId w:val="5"/>
   </w:num>
-  <w:num w:numId="4" w16cid:durableId="1204178232">
+  <w:num w:numId="4" w16cid:durableId="1042100103">
     <w:abstractNumId w:val="4"/>
   </w:num>
-  <w:num w:numId="5" w16cid:durableId="1918439004">
+  <w:num w:numId="5" w16cid:durableId="1500464604">
     <w:abstractNumId w:val="7"/>
   </w:num>
-  <w:num w:numId="6" w16cid:durableId="1120026614">
+  <w:num w:numId="6" w16cid:durableId="1242254218">
     <w:abstractNumId w:val="3"/>
   </w:num>
-  <w:num w:numId="7" w16cid:durableId="1425803675">
+  <w:num w:numId="7" w16cid:durableId="505022927">
     <w:abstractNumId w:val="2"/>
   </w:num>
-  <w:num w:numId="8" w16cid:durableId="1076127035">
+  <w:num w:numId="8" w16cid:durableId="338384680">
     <w:abstractNumId w:val="1"/>
   </w:num>
-  <w:num w:numId="9" w16cid:durableId="58597836">
+  <w:num w:numId="9" w16cid:durableId="1277106140">
     <w:abstractNumId w:val="0"/>
   </w:num>
 </w:numbering>
@@ -19326,7 +19326,7 @@
     <w:autoRedefine/>
     <w:uiPriority w:val="39"/>
     <w:unhideWhenUsed/>
-    <w:rsid w:val="00C62CAA"/>
+    <w:rsid w:val="00317CD1"/>
     <w:pPr>
       <w:spacing w:after="100"/>
     </w:pPr>
@@ -19336,7 +19336,7 @@
     <w:basedOn w:val="Phngmcinhcuaoanvn"/>
     <w:uiPriority w:val="99"/>
     <w:unhideWhenUsed/>
-    <w:rsid w:val="00C62CAA"/>
+    <w:rsid w:val="00317CD1"/>
     <w:rPr>
       <w:color w:val="0000FF" w:themeColor="hyperlink"/>
       <w:u w:val="single"/>
@@ -19349,7 +19349,7 @@
     <w:autoRedefine/>
     <w:uiPriority w:val="39"/>
     <w:unhideWhenUsed/>
-    <w:rsid w:val="00C62CAA"/>
+    <w:rsid w:val="00317CD1"/>
     <w:pPr>
       <w:spacing w:after="100"/>
       <w:ind w:left="260"/>

</xml_diff>

<commit_message>
Report: remove Ubuntu/WSL/SSH parts copied from sample (title, note 1.3, theory 2.2-2.3, WSL row in table 3.1, refs); keep only Docker + Jenkins practice
</commit_message>
<xml_diff>
--- a/Vietbaocao/Devops_bao_cao_NguyenDanhTai_102374.docx
+++ b/Vietbaocao/Devops_bao_cao_NguyenDanhTai_102374.docx
@@ -11,7 +11,7 @@
           <w:noProof/>
         </w:rPr>
         <w:drawing>
-          <wp:inline distT="0" distB="0" distL="0" distR="0" wp14:anchorId="59703E97" wp14:editId="421E0D22">
+          <wp:inline distT="0" distB="0" distL="0" distR="0" wp14:anchorId="7461BC31" wp14:editId="647DABB8">
             <wp:extent cx="4320000" cy="1803600"/>
             <wp:effectExtent l="0" t="0" r="0" b="0"/>
             <wp:docPr id="1" name="Picture 1"/>
@@ -140,7 +140,7 @@
           <w:b/>
           <w:color w:val="000000"/>
         </w:rPr>
-        <w:t>WSL UBUNTU, SSH, DOCKER VÀ JENKINS CI/CD</w:t>
+        <w:t>DOCKER VÀ JENKINS CI/CD</w:t>
       </w:r>
     </w:p>
     <w:p>
@@ -234,7 +234,7 @@
       <w:r>
         <w:fldChar w:fldCharType="separate"/>
       </w:r>
-      <w:hyperlink w:anchor="_Toc243091444" w:history="1">
+      <w:hyperlink w:anchor="_Toc243114662" w:history="1">
         <w:r>
           <w:rPr>
             <w:rStyle w:val="Siuktni"/>
@@ -261,7 +261,7 @@
             <w:noProof/>
             <w:webHidden/>
           </w:rPr>
-          <w:instrText xml:space="preserve"> PAGEREF _Toc243091444 \h </w:instrText>
+          <w:instrText xml:space="preserve"> PAGEREF _Toc243114662 \h </w:instrText>
         </w:r>
         <w:r>
           <w:rPr>
@@ -307,7 +307,7 @@
           <w14:ligatures w14:val="standardContextual"/>
         </w:rPr>
       </w:pPr>
-      <w:hyperlink w:anchor="_Toc243091445" w:history="1">
+      <w:hyperlink w:anchor="_Toc243114663" w:history="1">
         <w:r>
           <w:rPr>
             <w:rStyle w:val="Siuktni"/>
@@ -334,7 +334,7 @@
             <w:noProof/>
             <w:webHidden/>
           </w:rPr>
-          <w:instrText xml:space="preserve"> PAGEREF _Toc243091445 \h </w:instrText>
+          <w:instrText xml:space="preserve"> PAGEREF _Toc243114663 \h </w:instrText>
         </w:r>
         <w:r>
           <w:rPr>
@@ -380,7 +380,7 @@
           <w14:ligatures w14:val="standardContextual"/>
         </w:rPr>
       </w:pPr>
-      <w:hyperlink w:anchor="_Toc243091446" w:history="1">
+      <w:hyperlink w:anchor="_Toc243114664" w:history="1">
         <w:r>
           <w:rPr>
             <w:rStyle w:val="Siuktni"/>
@@ -407,7 +407,7 @@
             <w:noProof/>
             <w:webHidden/>
           </w:rPr>
-          <w:instrText xml:space="preserve"> PAGEREF _Toc243091446 \h </w:instrText>
+          <w:instrText xml:space="preserve"> PAGEREF _Toc243114664 \h </w:instrText>
         </w:r>
         <w:r>
           <w:rPr>
@@ -453,7 +453,7 @@
           <w14:ligatures w14:val="standardContextual"/>
         </w:rPr>
       </w:pPr>
-      <w:hyperlink w:anchor="_Toc243091447" w:history="1">
+      <w:hyperlink w:anchor="_Toc243114665" w:history="1">
         <w:r>
           <w:rPr>
             <w:rStyle w:val="Siuktni"/>
@@ -480,7 +480,7 @@
             <w:noProof/>
             <w:webHidden/>
           </w:rPr>
-          <w:instrText xml:space="preserve"> PAGEREF _Toc243091447 \h </w:instrText>
+          <w:instrText xml:space="preserve"> PAGEREF _Toc243114665 \h </w:instrText>
         </w:r>
         <w:r>
           <w:rPr>
@@ -526,7 +526,7 @@
           <w14:ligatures w14:val="standardContextual"/>
         </w:rPr>
       </w:pPr>
-      <w:hyperlink w:anchor="_Toc243091448" w:history="1">
+      <w:hyperlink w:anchor="_Toc243114666" w:history="1">
         <w:r>
           <w:rPr>
             <w:rStyle w:val="Siuktni"/>
@@ -553,7 +553,7 @@
             <w:noProof/>
             <w:webHidden/>
           </w:rPr>
-          <w:instrText xml:space="preserve"> PAGEREF _Toc243091448 \h </w:instrText>
+          <w:instrText xml:space="preserve"> PAGEREF _Toc243114666 \h </w:instrText>
         </w:r>
         <w:r>
           <w:rPr>
@@ -599,7 +599,7 @@
           <w14:ligatures w14:val="standardContextual"/>
         </w:rPr>
       </w:pPr>
-      <w:hyperlink w:anchor="_Toc243091449" w:history="1">
+      <w:hyperlink w:anchor="_Toc243114667" w:history="1">
         <w:r>
           <w:rPr>
             <w:rStyle w:val="Siuktni"/>
@@ -626,7 +626,7 @@
             <w:noProof/>
             <w:webHidden/>
           </w:rPr>
-          <w:instrText xml:space="preserve"> PAGEREF _Toc243091449 \h </w:instrText>
+          <w:instrText xml:space="preserve"> PAGEREF _Toc243114667 \h </w:instrText>
         </w:r>
         <w:r>
           <w:rPr>
@@ -672,13 +672,13 @@
           <w14:ligatures w14:val="standardContextual"/>
         </w:rPr>
       </w:pPr>
-      <w:hyperlink w:anchor="_Toc243091450" w:history="1">
+      <w:hyperlink w:anchor="_Toc243114668" w:history="1">
         <w:r>
           <w:rPr>
             <w:rStyle w:val="Siuktni"/>
             <w:noProof/>
           </w:rPr>
-          <w:t>2.2. WSL - Windows Subsystem for Linux</w:t>
+          <w:t>2.2. Docker và container</w:t>
         </w:r>
         <w:r>
           <w:rPr>
@@ -699,7 +699,7 @@
             <w:noProof/>
             <w:webHidden/>
           </w:rPr>
-          <w:instrText xml:space="preserve"> PAGEREF _Toc243091450 \h </w:instrText>
+          <w:instrText xml:space="preserve"> PAGEREF _Toc243114668 \h </w:instrText>
         </w:r>
         <w:r>
           <w:rPr>
@@ -745,13 +745,13 @@
           <w14:ligatures w14:val="standardContextual"/>
         </w:rPr>
       </w:pPr>
-      <w:hyperlink w:anchor="_Toc243091451" w:history="1">
+      <w:hyperlink w:anchor="_Toc243114669" w:history="1">
         <w:r>
           <w:rPr>
             <w:rStyle w:val="Siuktni"/>
             <w:noProof/>
           </w:rPr>
-          <w:t>2.3. SSH - Secure Shell</w:t>
+          <w:t>2.3. Jenkins</w:t>
         </w:r>
         <w:r>
           <w:rPr>
@@ -772,7 +772,7 @@
             <w:noProof/>
             <w:webHidden/>
           </w:rPr>
-          <w:instrText xml:space="preserve"> PAGEREF _Toc243091451 \h </w:instrText>
+          <w:instrText xml:space="preserve"> PAGEREF _Toc243114669 \h </w:instrText>
         </w:r>
         <w:r>
           <w:rPr>
@@ -793,6 +793,152 @@
             <w:webHidden/>
           </w:rPr>
           <w:t>6</w:t>
+        </w:r>
+        <w:r>
+          <w:rPr>
+            <w:noProof/>
+            <w:webHidden/>
+          </w:rPr>
+          <w:fldChar w:fldCharType="end"/>
+        </w:r>
+      </w:hyperlink>
+    </w:p>
+    <w:p>
+      <w:pPr>
+        <w:pStyle w:val="Mucluc1"/>
+        <w:tabs>
+          <w:tab w:val="right" w:leader="dot" w:pos="9061"/>
+        </w:tabs>
+        <w:rPr>
+          <w:rFonts w:asciiTheme="minorHAnsi" w:eastAsiaTheme="minorEastAsia" w:hAnsiTheme="minorHAnsi"/>
+          <w:noProof/>
+          <w:kern w:val="2"/>
+          <w:sz w:val="24"/>
+          <w:szCs w:val="24"/>
+          <w14:ligatures w14:val="standardContextual"/>
+        </w:rPr>
+      </w:pPr>
+      <w:hyperlink w:anchor="_Toc243114670" w:history="1">
+        <w:r>
+          <w:rPr>
+            <w:rStyle w:val="Siuktni"/>
+            <w:noProof/>
+          </w:rPr>
+          <w:t>CHƯƠNG 3. MÔI TRƯỜNG THỰC HIỆN</w:t>
+        </w:r>
+        <w:r>
+          <w:rPr>
+            <w:noProof/>
+            <w:webHidden/>
+          </w:rPr>
+          <w:tab/>
+        </w:r>
+        <w:r>
+          <w:rPr>
+            <w:noProof/>
+            <w:webHidden/>
+          </w:rPr>
+          <w:fldChar w:fldCharType="begin"/>
+        </w:r>
+        <w:r>
+          <w:rPr>
+            <w:noProof/>
+            <w:webHidden/>
+          </w:rPr>
+          <w:instrText xml:space="preserve"> PAGEREF _Toc243114670 \h </w:instrText>
+        </w:r>
+        <w:r>
+          <w:rPr>
+            <w:noProof/>
+            <w:webHidden/>
+          </w:rPr>
+        </w:r>
+        <w:r>
+          <w:rPr>
+            <w:noProof/>
+            <w:webHidden/>
+          </w:rPr>
+          <w:fldChar w:fldCharType="separate"/>
+        </w:r>
+        <w:r>
+          <w:rPr>
+            <w:noProof/>
+            <w:webHidden/>
+          </w:rPr>
+          <w:t>8</w:t>
+        </w:r>
+        <w:r>
+          <w:rPr>
+            <w:noProof/>
+            <w:webHidden/>
+          </w:rPr>
+          <w:fldChar w:fldCharType="end"/>
+        </w:r>
+      </w:hyperlink>
+    </w:p>
+    <w:p>
+      <w:pPr>
+        <w:pStyle w:val="Mucluc1"/>
+        <w:tabs>
+          <w:tab w:val="right" w:leader="dot" w:pos="9061"/>
+        </w:tabs>
+        <w:rPr>
+          <w:rFonts w:asciiTheme="minorHAnsi" w:eastAsiaTheme="minorEastAsia" w:hAnsiTheme="minorHAnsi"/>
+          <w:noProof/>
+          <w:kern w:val="2"/>
+          <w:sz w:val="24"/>
+          <w:szCs w:val="24"/>
+          <w14:ligatures w14:val="standardContextual"/>
+        </w:rPr>
+      </w:pPr>
+      <w:hyperlink w:anchor="_Toc243114671" w:history="1">
+        <w:r>
+          <w:rPr>
+            <w:rStyle w:val="Siuktni"/>
+            <w:noProof/>
+          </w:rPr>
+          <w:t>CHƯƠNG 4. TRIỂN KHAI THỰC HIỆN</w:t>
+        </w:r>
+        <w:r>
+          <w:rPr>
+            <w:noProof/>
+            <w:webHidden/>
+          </w:rPr>
+          <w:tab/>
+        </w:r>
+        <w:r>
+          <w:rPr>
+            <w:noProof/>
+            <w:webHidden/>
+          </w:rPr>
+          <w:fldChar w:fldCharType="begin"/>
+        </w:r>
+        <w:r>
+          <w:rPr>
+            <w:noProof/>
+            <w:webHidden/>
+          </w:rPr>
+          <w:instrText xml:space="preserve"> PAGEREF _Toc243114671 \h </w:instrText>
+        </w:r>
+        <w:r>
+          <w:rPr>
+            <w:noProof/>
+            <w:webHidden/>
+          </w:rPr>
+        </w:r>
+        <w:r>
+          <w:rPr>
+            <w:noProof/>
+            <w:webHidden/>
+          </w:rPr>
+          <w:fldChar w:fldCharType="separate"/>
+        </w:r>
+        <w:r>
+          <w:rPr>
+            <w:noProof/>
+            <w:webHidden/>
+          </w:rPr>
+          <w:t>9</w:t>
         </w:r>
         <w:r>
           <w:rPr>
@@ -818,13 +964,13 @@
           <w14:ligatures w14:val="standardContextual"/>
         </w:rPr>
       </w:pPr>
-      <w:hyperlink w:anchor="_Toc243091452" w:history="1">
+      <w:hyperlink w:anchor="_Toc243114672" w:history="1">
         <w:r>
           <w:rPr>
             <w:rStyle w:val="Siuktni"/>
             <w:noProof/>
           </w:rPr>
-          <w:t>2.4. Docker và container</w:t>
+          <w:t>4.1. Tạo docker-compose.yml và chạy lần đầu</w:t>
         </w:r>
         <w:r>
           <w:rPr>
@@ -845,7 +991,7 @@
             <w:noProof/>
             <w:webHidden/>
           </w:rPr>
-          <w:instrText xml:space="preserve"> PAGEREF _Toc243091452 \h </w:instrText>
+          <w:instrText xml:space="preserve"> PAGEREF _Toc243114672 \h </w:instrText>
         </w:r>
         <w:r>
           <w:rPr>
@@ -865,7 +1011,7 @@
             <w:noProof/>
             <w:webHidden/>
           </w:rPr>
-          <w:t>6</w:t>
+          <w:t>9</w:t>
         </w:r>
         <w:r>
           <w:rPr>
@@ -891,13 +1037,13 @@
           <w14:ligatures w14:val="standardContextual"/>
         </w:rPr>
       </w:pPr>
-      <w:hyperlink w:anchor="_Toc243091453" w:history="1">
+      <w:hyperlink w:anchor="_Toc243114673" w:history="1">
         <w:r>
           <w:rPr>
             <w:rStyle w:val="Siuktni"/>
             <w:noProof/>
           </w:rPr>
-          <w:t>2.5. Jenkins</w:t>
+          <w:t>4.2. Kiểm tra container, push image và build lại</w:t>
         </w:r>
         <w:r>
           <w:rPr>
@@ -918,7 +1064,7 @@
             <w:noProof/>
             <w:webHidden/>
           </w:rPr>
-          <w:instrText xml:space="preserve"> PAGEREF _Toc243091453 \h </w:instrText>
+          <w:instrText xml:space="preserve"> PAGEREF _Toc243114673 \h </w:instrText>
         </w:r>
         <w:r>
           <w:rPr>
@@ -938,7 +1084,153 @@
             <w:noProof/>
             <w:webHidden/>
           </w:rPr>
-          <w:t>7</w:t>
+          <w:t>10</w:t>
+        </w:r>
+        <w:r>
+          <w:rPr>
+            <w:noProof/>
+            <w:webHidden/>
+          </w:rPr>
+          <w:fldChar w:fldCharType="end"/>
+        </w:r>
+      </w:hyperlink>
+    </w:p>
+    <w:p>
+      <w:pPr>
+        <w:pStyle w:val="Mucluc2"/>
+        <w:tabs>
+          <w:tab w:val="right" w:leader="dot" w:pos="9061"/>
+        </w:tabs>
+        <w:rPr>
+          <w:rFonts w:asciiTheme="minorHAnsi" w:eastAsiaTheme="minorEastAsia" w:hAnsiTheme="minorHAnsi"/>
+          <w:noProof/>
+          <w:kern w:val="2"/>
+          <w:sz w:val="24"/>
+          <w:szCs w:val="24"/>
+          <w14:ligatures w14:val="standardContextual"/>
+        </w:rPr>
+      </w:pPr>
+      <w:hyperlink w:anchor="_Toc243114674" w:history="1">
+        <w:r>
+          <w:rPr>
+            <w:rStyle w:val="Siuktni"/>
+            <w:noProof/>
+          </w:rPr>
+          <w:t>4.3. Hoàn tất build lại, push bản mới và kết quả</w:t>
+        </w:r>
+        <w:r>
+          <w:rPr>
+            <w:noProof/>
+            <w:webHidden/>
+          </w:rPr>
+          <w:tab/>
+        </w:r>
+        <w:r>
+          <w:rPr>
+            <w:noProof/>
+            <w:webHidden/>
+          </w:rPr>
+          <w:fldChar w:fldCharType="begin"/>
+        </w:r>
+        <w:r>
+          <w:rPr>
+            <w:noProof/>
+            <w:webHidden/>
+          </w:rPr>
+          <w:instrText xml:space="preserve"> PAGEREF _Toc243114674 \h </w:instrText>
+        </w:r>
+        <w:r>
+          <w:rPr>
+            <w:noProof/>
+            <w:webHidden/>
+          </w:rPr>
+        </w:r>
+        <w:r>
+          <w:rPr>
+            <w:noProof/>
+            <w:webHidden/>
+          </w:rPr>
+          <w:fldChar w:fldCharType="separate"/>
+        </w:r>
+        <w:r>
+          <w:rPr>
+            <w:noProof/>
+            <w:webHidden/>
+          </w:rPr>
+          <w:t>11</w:t>
+        </w:r>
+        <w:r>
+          <w:rPr>
+            <w:noProof/>
+            <w:webHidden/>
+          </w:rPr>
+          <w:fldChar w:fldCharType="end"/>
+        </w:r>
+      </w:hyperlink>
+    </w:p>
+    <w:p>
+      <w:pPr>
+        <w:pStyle w:val="Mucluc2"/>
+        <w:tabs>
+          <w:tab w:val="right" w:leader="dot" w:pos="9061"/>
+        </w:tabs>
+        <w:rPr>
+          <w:rFonts w:asciiTheme="minorHAnsi" w:eastAsiaTheme="minorEastAsia" w:hAnsiTheme="minorHAnsi"/>
+          <w:noProof/>
+          <w:kern w:val="2"/>
+          <w:sz w:val="24"/>
+          <w:szCs w:val="24"/>
+          <w14:ligatures w14:val="standardContextual"/>
+        </w:rPr>
+      </w:pPr>
+      <w:hyperlink w:anchor="_Toc243114675" w:history="1">
+        <w:r>
+          <w:rPr>
+            <w:rStyle w:val="Siuktni"/>
+            <w:noProof/>
+          </w:rPr>
+          <w:t>4.4. Viết Jenkins cho dự án</w:t>
+        </w:r>
+        <w:r>
+          <w:rPr>
+            <w:noProof/>
+            <w:webHidden/>
+          </w:rPr>
+          <w:tab/>
+        </w:r>
+        <w:r>
+          <w:rPr>
+            <w:noProof/>
+            <w:webHidden/>
+          </w:rPr>
+          <w:fldChar w:fldCharType="begin"/>
+        </w:r>
+        <w:r>
+          <w:rPr>
+            <w:noProof/>
+            <w:webHidden/>
+          </w:rPr>
+          <w:instrText xml:space="preserve"> PAGEREF _Toc243114675 \h </w:instrText>
+        </w:r>
+        <w:r>
+          <w:rPr>
+            <w:noProof/>
+            <w:webHidden/>
+          </w:rPr>
+        </w:r>
+        <w:r>
+          <w:rPr>
+            <w:noProof/>
+            <w:webHidden/>
+          </w:rPr>
+          <w:fldChar w:fldCharType="separate"/>
+        </w:r>
+        <w:r>
+          <w:rPr>
+            <w:noProof/>
+            <w:webHidden/>
+          </w:rPr>
+          <w:t>13</w:t>
         </w:r>
         <w:r>
           <w:rPr>
@@ -964,13 +1256,13 @@
           <w14:ligatures w14:val="standardContextual"/>
         </w:rPr>
       </w:pPr>
-      <w:hyperlink w:anchor="_Toc243091454" w:history="1">
+      <w:hyperlink w:anchor="_Toc243114676" w:history="1">
         <w:r>
           <w:rPr>
             <w:rStyle w:val="Siuktni"/>
             <w:noProof/>
           </w:rPr>
-          <w:t>CHƯƠNG 3. MÔI TRƯỜNG THỰC HIỆN</w:t>
+          <w:t>CHƯƠNG 5. ĐÁNH GIÁ VÀ KẾT LUẬN</w:t>
         </w:r>
         <w:r>
           <w:rPr>
@@ -991,7 +1283,7 @@
             <w:noProof/>
             <w:webHidden/>
           </w:rPr>
-          <w:instrText xml:space="preserve"> PAGEREF _Toc243091454 \h </w:instrText>
+          <w:instrText xml:space="preserve"> PAGEREF _Toc243114676 \h </w:instrText>
         </w:r>
         <w:r>
           <w:rPr>
@@ -1011,7 +1303,299 @@
             <w:noProof/>
             <w:webHidden/>
           </w:rPr>
-          <w:t>8</w:t>
+          <w:t>17</w:t>
+        </w:r>
+        <w:r>
+          <w:rPr>
+            <w:noProof/>
+            <w:webHidden/>
+          </w:rPr>
+          <w:fldChar w:fldCharType="end"/>
+        </w:r>
+      </w:hyperlink>
+    </w:p>
+    <w:p>
+      <w:pPr>
+        <w:pStyle w:val="Mucluc2"/>
+        <w:tabs>
+          <w:tab w:val="right" w:leader="dot" w:pos="9061"/>
+        </w:tabs>
+        <w:rPr>
+          <w:rFonts w:asciiTheme="minorHAnsi" w:eastAsiaTheme="minorEastAsia" w:hAnsiTheme="minorHAnsi"/>
+          <w:noProof/>
+          <w:kern w:val="2"/>
+          <w:sz w:val="24"/>
+          <w:szCs w:val="24"/>
+          <w14:ligatures w14:val="standardContextual"/>
+        </w:rPr>
+      </w:pPr>
+      <w:hyperlink w:anchor="_Toc243114677" w:history="1">
+        <w:r>
+          <w:rPr>
+            <w:rStyle w:val="Siuktni"/>
+            <w:noProof/>
+          </w:rPr>
+          <w:t>5.1. Kết quả đạt được</w:t>
+        </w:r>
+        <w:r>
+          <w:rPr>
+            <w:noProof/>
+            <w:webHidden/>
+          </w:rPr>
+          <w:tab/>
+        </w:r>
+        <w:r>
+          <w:rPr>
+            <w:noProof/>
+            <w:webHidden/>
+          </w:rPr>
+          <w:fldChar w:fldCharType="begin"/>
+        </w:r>
+        <w:r>
+          <w:rPr>
+            <w:noProof/>
+            <w:webHidden/>
+          </w:rPr>
+          <w:instrText xml:space="preserve"> PAGEREF _Toc243114677 \h </w:instrText>
+        </w:r>
+        <w:r>
+          <w:rPr>
+            <w:noProof/>
+            <w:webHidden/>
+          </w:rPr>
+        </w:r>
+        <w:r>
+          <w:rPr>
+            <w:noProof/>
+            <w:webHidden/>
+          </w:rPr>
+          <w:fldChar w:fldCharType="separate"/>
+        </w:r>
+        <w:r>
+          <w:rPr>
+            <w:noProof/>
+            <w:webHidden/>
+          </w:rPr>
+          <w:t>17</w:t>
+        </w:r>
+        <w:r>
+          <w:rPr>
+            <w:noProof/>
+            <w:webHidden/>
+          </w:rPr>
+          <w:fldChar w:fldCharType="end"/>
+        </w:r>
+      </w:hyperlink>
+    </w:p>
+    <w:p>
+      <w:pPr>
+        <w:pStyle w:val="Mucluc2"/>
+        <w:tabs>
+          <w:tab w:val="right" w:leader="dot" w:pos="9061"/>
+        </w:tabs>
+        <w:rPr>
+          <w:rFonts w:asciiTheme="minorHAnsi" w:eastAsiaTheme="minorEastAsia" w:hAnsiTheme="minorHAnsi"/>
+          <w:noProof/>
+          <w:kern w:val="2"/>
+          <w:sz w:val="24"/>
+          <w:szCs w:val="24"/>
+          <w14:ligatures w14:val="standardContextual"/>
+        </w:rPr>
+      </w:pPr>
+      <w:hyperlink w:anchor="_Toc243114678" w:history="1">
+        <w:r>
+          <w:rPr>
+            <w:rStyle w:val="Siuktni"/>
+            <w:noProof/>
+          </w:rPr>
+          <w:t>5.2. Một số lưu ý và cách xử lý</w:t>
+        </w:r>
+        <w:r>
+          <w:rPr>
+            <w:noProof/>
+            <w:webHidden/>
+          </w:rPr>
+          <w:tab/>
+        </w:r>
+        <w:r>
+          <w:rPr>
+            <w:noProof/>
+            <w:webHidden/>
+          </w:rPr>
+          <w:fldChar w:fldCharType="begin"/>
+        </w:r>
+        <w:r>
+          <w:rPr>
+            <w:noProof/>
+            <w:webHidden/>
+          </w:rPr>
+          <w:instrText xml:space="preserve"> PAGEREF _Toc243114678 \h </w:instrText>
+        </w:r>
+        <w:r>
+          <w:rPr>
+            <w:noProof/>
+            <w:webHidden/>
+          </w:rPr>
+        </w:r>
+        <w:r>
+          <w:rPr>
+            <w:noProof/>
+            <w:webHidden/>
+          </w:rPr>
+          <w:fldChar w:fldCharType="separate"/>
+        </w:r>
+        <w:r>
+          <w:rPr>
+            <w:noProof/>
+            <w:webHidden/>
+          </w:rPr>
+          <w:t>17</w:t>
+        </w:r>
+        <w:r>
+          <w:rPr>
+            <w:noProof/>
+            <w:webHidden/>
+          </w:rPr>
+          <w:fldChar w:fldCharType="end"/>
+        </w:r>
+      </w:hyperlink>
+    </w:p>
+    <w:p>
+      <w:pPr>
+        <w:pStyle w:val="Mucluc2"/>
+        <w:tabs>
+          <w:tab w:val="right" w:leader="dot" w:pos="9061"/>
+        </w:tabs>
+        <w:rPr>
+          <w:rFonts w:asciiTheme="minorHAnsi" w:eastAsiaTheme="minorEastAsia" w:hAnsiTheme="minorHAnsi"/>
+          <w:noProof/>
+          <w:kern w:val="2"/>
+          <w:sz w:val="24"/>
+          <w:szCs w:val="24"/>
+          <w14:ligatures w14:val="standardContextual"/>
+        </w:rPr>
+      </w:pPr>
+      <w:hyperlink w:anchor="_Toc243114679" w:history="1">
+        <w:r>
+          <w:rPr>
+            <w:rStyle w:val="Siuktni"/>
+            <w:noProof/>
+          </w:rPr>
+          <w:t>5.3. Hướng phát triển</w:t>
+        </w:r>
+        <w:r>
+          <w:rPr>
+            <w:noProof/>
+            <w:webHidden/>
+          </w:rPr>
+          <w:tab/>
+        </w:r>
+        <w:r>
+          <w:rPr>
+            <w:noProof/>
+            <w:webHidden/>
+          </w:rPr>
+          <w:fldChar w:fldCharType="begin"/>
+        </w:r>
+        <w:r>
+          <w:rPr>
+            <w:noProof/>
+            <w:webHidden/>
+          </w:rPr>
+          <w:instrText xml:space="preserve"> PAGEREF _Toc243114679 \h </w:instrText>
+        </w:r>
+        <w:r>
+          <w:rPr>
+            <w:noProof/>
+            <w:webHidden/>
+          </w:rPr>
+        </w:r>
+        <w:r>
+          <w:rPr>
+            <w:noProof/>
+            <w:webHidden/>
+          </w:rPr>
+          <w:fldChar w:fldCharType="separate"/>
+        </w:r>
+        <w:r>
+          <w:rPr>
+            <w:noProof/>
+            <w:webHidden/>
+          </w:rPr>
+          <w:t>18</w:t>
+        </w:r>
+        <w:r>
+          <w:rPr>
+            <w:noProof/>
+            <w:webHidden/>
+          </w:rPr>
+          <w:fldChar w:fldCharType="end"/>
+        </w:r>
+      </w:hyperlink>
+    </w:p>
+    <w:p>
+      <w:pPr>
+        <w:pStyle w:val="Mucluc2"/>
+        <w:tabs>
+          <w:tab w:val="right" w:leader="dot" w:pos="9061"/>
+        </w:tabs>
+        <w:rPr>
+          <w:rFonts w:asciiTheme="minorHAnsi" w:eastAsiaTheme="minorEastAsia" w:hAnsiTheme="minorHAnsi"/>
+          <w:noProof/>
+          <w:kern w:val="2"/>
+          <w:sz w:val="24"/>
+          <w:szCs w:val="24"/>
+          <w14:ligatures w14:val="standardContextual"/>
+        </w:rPr>
+      </w:pPr>
+      <w:hyperlink w:anchor="_Toc243114680" w:history="1">
+        <w:r>
+          <w:rPr>
+            <w:rStyle w:val="Siuktni"/>
+            <w:noProof/>
+          </w:rPr>
+          <w:t>5.4. Kết luận</w:t>
+        </w:r>
+        <w:r>
+          <w:rPr>
+            <w:noProof/>
+            <w:webHidden/>
+          </w:rPr>
+          <w:tab/>
+        </w:r>
+        <w:r>
+          <w:rPr>
+            <w:noProof/>
+            <w:webHidden/>
+          </w:rPr>
+          <w:fldChar w:fldCharType="begin"/>
+        </w:r>
+        <w:r>
+          <w:rPr>
+            <w:noProof/>
+            <w:webHidden/>
+          </w:rPr>
+          <w:instrText xml:space="preserve"> PAGEREF _Toc243114680 \h </w:instrText>
+        </w:r>
+        <w:r>
+          <w:rPr>
+            <w:noProof/>
+            <w:webHidden/>
+          </w:rPr>
+        </w:r>
+        <w:r>
+          <w:rPr>
+            <w:noProof/>
+            <w:webHidden/>
+          </w:rPr>
+          <w:fldChar w:fldCharType="separate"/>
+        </w:r>
+        <w:r>
+          <w:rPr>
+            <w:noProof/>
+            <w:webHidden/>
+          </w:rPr>
+          <w:t>18</w:t>
         </w:r>
         <w:r>
           <w:rPr>
@@ -1037,13 +1621,13 @@
           <w14:ligatures w14:val="standardContextual"/>
         </w:rPr>
       </w:pPr>
-      <w:hyperlink w:anchor="_Toc243091455" w:history="1">
+      <w:hyperlink w:anchor="_Toc243114681" w:history="1">
         <w:r>
           <w:rPr>
             <w:rStyle w:val="Siuktni"/>
             <w:noProof/>
           </w:rPr>
-          <w:t>CHƯƠNG 4. TRIỂN KHAI THỰC HIỆN</w:t>
+          <w:t>TÀI LIỆU THAM KHẢO</w:t>
         </w:r>
         <w:r>
           <w:rPr>
@@ -1064,737 +1648,7 @@
             <w:noProof/>
             <w:webHidden/>
           </w:rPr>
-          <w:instrText xml:space="preserve"> PAGEREF _Toc243091455 \h </w:instrText>
-        </w:r>
-        <w:r>
-          <w:rPr>
-            <w:noProof/>
-            <w:webHidden/>
-          </w:rPr>
-        </w:r>
-        <w:r>
-          <w:rPr>
-            <w:noProof/>
-            <w:webHidden/>
-          </w:rPr>
-          <w:fldChar w:fldCharType="separate"/>
-        </w:r>
-        <w:r>
-          <w:rPr>
-            <w:noProof/>
-            <w:webHidden/>
-          </w:rPr>
-          <w:t>9</w:t>
-        </w:r>
-        <w:r>
-          <w:rPr>
-            <w:noProof/>
-            <w:webHidden/>
-          </w:rPr>
-          <w:fldChar w:fldCharType="end"/>
-        </w:r>
-      </w:hyperlink>
-    </w:p>
-    <w:p>
-      <w:pPr>
-        <w:pStyle w:val="Mucluc2"/>
-        <w:tabs>
-          <w:tab w:val="right" w:leader="dot" w:pos="9061"/>
-        </w:tabs>
-        <w:rPr>
-          <w:rFonts w:asciiTheme="minorHAnsi" w:eastAsiaTheme="minorEastAsia" w:hAnsiTheme="minorHAnsi"/>
-          <w:noProof/>
-          <w:kern w:val="2"/>
-          <w:sz w:val="24"/>
-          <w:szCs w:val="24"/>
-          <w14:ligatures w14:val="standardContextual"/>
-        </w:rPr>
-      </w:pPr>
-      <w:hyperlink w:anchor="_Toc243091456" w:history="1">
-        <w:r>
-          <w:rPr>
-            <w:rStyle w:val="Siuktni"/>
-            <w:noProof/>
-          </w:rPr>
-          <w:t>4.1. Tạo docker-compose.yml và chạy lần đầu</w:t>
-        </w:r>
-        <w:r>
-          <w:rPr>
-            <w:noProof/>
-            <w:webHidden/>
-          </w:rPr>
-          <w:tab/>
-        </w:r>
-        <w:r>
-          <w:rPr>
-            <w:noProof/>
-            <w:webHidden/>
-          </w:rPr>
-          <w:fldChar w:fldCharType="begin"/>
-        </w:r>
-        <w:r>
-          <w:rPr>
-            <w:noProof/>
-            <w:webHidden/>
-          </w:rPr>
-          <w:instrText xml:space="preserve"> PAGEREF _Toc243091456 \h </w:instrText>
-        </w:r>
-        <w:r>
-          <w:rPr>
-            <w:noProof/>
-            <w:webHidden/>
-          </w:rPr>
-        </w:r>
-        <w:r>
-          <w:rPr>
-            <w:noProof/>
-            <w:webHidden/>
-          </w:rPr>
-          <w:fldChar w:fldCharType="separate"/>
-        </w:r>
-        <w:r>
-          <w:rPr>
-            <w:noProof/>
-            <w:webHidden/>
-          </w:rPr>
-          <w:t>9</w:t>
-        </w:r>
-        <w:r>
-          <w:rPr>
-            <w:noProof/>
-            <w:webHidden/>
-          </w:rPr>
-          <w:fldChar w:fldCharType="end"/>
-        </w:r>
-      </w:hyperlink>
-    </w:p>
-    <w:p>
-      <w:pPr>
-        <w:pStyle w:val="Mucluc2"/>
-        <w:tabs>
-          <w:tab w:val="right" w:leader="dot" w:pos="9061"/>
-        </w:tabs>
-        <w:rPr>
-          <w:rFonts w:asciiTheme="minorHAnsi" w:eastAsiaTheme="minorEastAsia" w:hAnsiTheme="minorHAnsi"/>
-          <w:noProof/>
-          <w:kern w:val="2"/>
-          <w:sz w:val="24"/>
-          <w:szCs w:val="24"/>
-          <w14:ligatures w14:val="standardContextual"/>
-        </w:rPr>
-      </w:pPr>
-      <w:hyperlink w:anchor="_Toc243091457" w:history="1">
-        <w:r>
-          <w:rPr>
-            <w:rStyle w:val="Siuktni"/>
-            <w:noProof/>
-          </w:rPr>
-          <w:t>4.2. Kiểm tra container, push image và build lại</w:t>
-        </w:r>
-        <w:r>
-          <w:rPr>
-            <w:noProof/>
-            <w:webHidden/>
-          </w:rPr>
-          <w:tab/>
-        </w:r>
-        <w:r>
-          <w:rPr>
-            <w:noProof/>
-            <w:webHidden/>
-          </w:rPr>
-          <w:fldChar w:fldCharType="begin"/>
-        </w:r>
-        <w:r>
-          <w:rPr>
-            <w:noProof/>
-            <w:webHidden/>
-          </w:rPr>
-          <w:instrText xml:space="preserve"> PAGEREF _Toc243091457 \h </w:instrText>
-        </w:r>
-        <w:r>
-          <w:rPr>
-            <w:noProof/>
-            <w:webHidden/>
-          </w:rPr>
-        </w:r>
-        <w:r>
-          <w:rPr>
-            <w:noProof/>
-            <w:webHidden/>
-          </w:rPr>
-          <w:fldChar w:fldCharType="separate"/>
-        </w:r>
-        <w:r>
-          <w:rPr>
-            <w:noProof/>
-            <w:webHidden/>
-          </w:rPr>
-          <w:t>10</w:t>
-        </w:r>
-        <w:r>
-          <w:rPr>
-            <w:noProof/>
-            <w:webHidden/>
-          </w:rPr>
-          <w:fldChar w:fldCharType="end"/>
-        </w:r>
-      </w:hyperlink>
-    </w:p>
-    <w:p>
-      <w:pPr>
-        <w:pStyle w:val="Mucluc2"/>
-        <w:tabs>
-          <w:tab w:val="right" w:leader="dot" w:pos="9061"/>
-        </w:tabs>
-        <w:rPr>
-          <w:rFonts w:asciiTheme="minorHAnsi" w:eastAsiaTheme="minorEastAsia" w:hAnsiTheme="minorHAnsi"/>
-          <w:noProof/>
-          <w:kern w:val="2"/>
-          <w:sz w:val="24"/>
-          <w:szCs w:val="24"/>
-          <w14:ligatures w14:val="standardContextual"/>
-        </w:rPr>
-      </w:pPr>
-      <w:hyperlink w:anchor="_Toc243091458" w:history="1">
-        <w:r>
-          <w:rPr>
-            <w:rStyle w:val="Siuktni"/>
-            <w:noProof/>
-          </w:rPr>
-          <w:t>4.3. Hoàn tất build lại, push bản mới và kết quả</w:t>
-        </w:r>
-        <w:r>
-          <w:rPr>
-            <w:noProof/>
-            <w:webHidden/>
-          </w:rPr>
-          <w:tab/>
-        </w:r>
-        <w:r>
-          <w:rPr>
-            <w:noProof/>
-            <w:webHidden/>
-          </w:rPr>
-          <w:fldChar w:fldCharType="begin"/>
-        </w:r>
-        <w:r>
-          <w:rPr>
-            <w:noProof/>
-            <w:webHidden/>
-          </w:rPr>
-          <w:instrText xml:space="preserve"> PAGEREF _Toc243091458 \h </w:instrText>
-        </w:r>
-        <w:r>
-          <w:rPr>
-            <w:noProof/>
-            <w:webHidden/>
-          </w:rPr>
-        </w:r>
-        <w:r>
-          <w:rPr>
-            <w:noProof/>
-            <w:webHidden/>
-          </w:rPr>
-          <w:fldChar w:fldCharType="separate"/>
-        </w:r>
-        <w:r>
-          <w:rPr>
-            <w:noProof/>
-            <w:webHidden/>
-          </w:rPr>
-          <w:t>11</w:t>
-        </w:r>
-        <w:r>
-          <w:rPr>
-            <w:noProof/>
-            <w:webHidden/>
-          </w:rPr>
-          <w:fldChar w:fldCharType="end"/>
-        </w:r>
-      </w:hyperlink>
-    </w:p>
-    <w:p>
-      <w:pPr>
-        <w:pStyle w:val="Mucluc2"/>
-        <w:tabs>
-          <w:tab w:val="right" w:leader="dot" w:pos="9061"/>
-        </w:tabs>
-        <w:rPr>
-          <w:rFonts w:asciiTheme="minorHAnsi" w:eastAsiaTheme="minorEastAsia" w:hAnsiTheme="minorHAnsi"/>
-          <w:noProof/>
-          <w:kern w:val="2"/>
-          <w:sz w:val="24"/>
-          <w:szCs w:val="24"/>
-          <w14:ligatures w14:val="standardContextual"/>
-        </w:rPr>
-      </w:pPr>
-      <w:hyperlink w:anchor="_Toc243091459" w:history="1">
-        <w:r>
-          <w:rPr>
-            <w:rStyle w:val="Siuktni"/>
-            <w:noProof/>
-          </w:rPr>
-          <w:t>4.4. Viết Jenkins cho dự án</w:t>
-        </w:r>
-        <w:r>
-          <w:rPr>
-            <w:noProof/>
-            <w:webHidden/>
-          </w:rPr>
-          <w:tab/>
-        </w:r>
-        <w:r>
-          <w:rPr>
-            <w:noProof/>
-            <w:webHidden/>
-          </w:rPr>
-          <w:fldChar w:fldCharType="begin"/>
-        </w:r>
-        <w:r>
-          <w:rPr>
-            <w:noProof/>
-            <w:webHidden/>
-          </w:rPr>
-          <w:instrText xml:space="preserve"> PAGEREF _Toc243091459 \h </w:instrText>
-        </w:r>
-        <w:r>
-          <w:rPr>
-            <w:noProof/>
-            <w:webHidden/>
-          </w:rPr>
-        </w:r>
-        <w:r>
-          <w:rPr>
-            <w:noProof/>
-            <w:webHidden/>
-          </w:rPr>
-          <w:fldChar w:fldCharType="separate"/>
-        </w:r>
-        <w:r>
-          <w:rPr>
-            <w:noProof/>
-            <w:webHidden/>
-          </w:rPr>
-          <w:t>13</w:t>
-        </w:r>
-        <w:r>
-          <w:rPr>
-            <w:noProof/>
-            <w:webHidden/>
-          </w:rPr>
-          <w:fldChar w:fldCharType="end"/>
-        </w:r>
-      </w:hyperlink>
-    </w:p>
-    <w:p>
-      <w:pPr>
-        <w:pStyle w:val="Mucluc1"/>
-        <w:tabs>
-          <w:tab w:val="right" w:leader="dot" w:pos="9061"/>
-        </w:tabs>
-        <w:rPr>
-          <w:rFonts w:asciiTheme="minorHAnsi" w:eastAsiaTheme="minorEastAsia" w:hAnsiTheme="minorHAnsi"/>
-          <w:noProof/>
-          <w:kern w:val="2"/>
-          <w:sz w:val="24"/>
-          <w:szCs w:val="24"/>
-          <w14:ligatures w14:val="standardContextual"/>
-        </w:rPr>
-      </w:pPr>
-      <w:hyperlink w:anchor="_Toc243091460" w:history="1">
-        <w:r>
-          <w:rPr>
-            <w:rStyle w:val="Siuktni"/>
-            <w:noProof/>
-          </w:rPr>
-          <w:t>CHƯƠNG 5. ĐÁNH GIÁ VÀ KẾT LUẬN</w:t>
-        </w:r>
-        <w:r>
-          <w:rPr>
-            <w:noProof/>
-            <w:webHidden/>
-          </w:rPr>
-          <w:tab/>
-        </w:r>
-        <w:r>
-          <w:rPr>
-            <w:noProof/>
-            <w:webHidden/>
-          </w:rPr>
-          <w:fldChar w:fldCharType="begin"/>
-        </w:r>
-        <w:r>
-          <w:rPr>
-            <w:noProof/>
-            <w:webHidden/>
-          </w:rPr>
-          <w:instrText xml:space="preserve"> PAGEREF _Toc243091460 \h </w:instrText>
-        </w:r>
-        <w:r>
-          <w:rPr>
-            <w:noProof/>
-            <w:webHidden/>
-          </w:rPr>
-        </w:r>
-        <w:r>
-          <w:rPr>
-            <w:noProof/>
-            <w:webHidden/>
-          </w:rPr>
-          <w:fldChar w:fldCharType="separate"/>
-        </w:r>
-        <w:r>
-          <w:rPr>
-            <w:noProof/>
-            <w:webHidden/>
-          </w:rPr>
-          <w:t>17</w:t>
-        </w:r>
-        <w:r>
-          <w:rPr>
-            <w:noProof/>
-            <w:webHidden/>
-          </w:rPr>
-          <w:fldChar w:fldCharType="end"/>
-        </w:r>
-      </w:hyperlink>
-    </w:p>
-    <w:p>
-      <w:pPr>
-        <w:pStyle w:val="Mucluc2"/>
-        <w:tabs>
-          <w:tab w:val="right" w:leader="dot" w:pos="9061"/>
-        </w:tabs>
-        <w:rPr>
-          <w:rFonts w:asciiTheme="minorHAnsi" w:eastAsiaTheme="minorEastAsia" w:hAnsiTheme="minorHAnsi"/>
-          <w:noProof/>
-          <w:kern w:val="2"/>
-          <w:sz w:val="24"/>
-          <w:szCs w:val="24"/>
-          <w14:ligatures w14:val="standardContextual"/>
-        </w:rPr>
-      </w:pPr>
-      <w:hyperlink w:anchor="_Toc243091461" w:history="1">
-        <w:r>
-          <w:rPr>
-            <w:rStyle w:val="Siuktni"/>
-            <w:noProof/>
-          </w:rPr>
-          <w:t>5.1. Kết quả đạt được</w:t>
-        </w:r>
-        <w:r>
-          <w:rPr>
-            <w:noProof/>
-            <w:webHidden/>
-          </w:rPr>
-          <w:tab/>
-        </w:r>
-        <w:r>
-          <w:rPr>
-            <w:noProof/>
-            <w:webHidden/>
-          </w:rPr>
-          <w:fldChar w:fldCharType="begin"/>
-        </w:r>
-        <w:r>
-          <w:rPr>
-            <w:noProof/>
-            <w:webHidden/>
-          </w:rPr>
-          <w:instrText xml:space="preserve"> PAGEREF _Toc243091461 \h </w:instrText>
-        </w:r>
-        <w:r>
-          <w:rPr>
-            <w:noProof/>
-            <w:webHidden/>
-          </w:rPr>
-        </w:r>
-        <w:r>
-          <w:rPr>
-            <w:noProof/>
-            <w:webHidden/>
-          </w:rPr>
-          <w:fldChar w:fldCharType="separate"/>
-        </w:r>
-        <w:r>
-          <w:rPr>
-            <w:noProof/>
-            <w:webHidden/>
-          </w:rPr>
-          <w:t>17</w:t>
-        </w:r>
-        <w:r>
-          <w:rPr>
-            <w:noProof/>
-            <w:webHidden/>
-          </w:rPr>
-          <w:fldChar w:fldCharType="end"/>
-        </w:r>
-      </w:hyperlink>
-    </w:p>
-    <w:p>
-      <w:pPr>
-        <w:pStyle w:val="Mucluc2"/>
-        <w:tabs>
-          <w:tab w:val="right" w:leader="dot" w:pos="9061"/>
-        </w:tabs>
-        <w:rPr>
-          <w:rFonts w:asciiTheme="minorHAnsi" w:eastAsiaTheme="minorEastAsia" w:hAnsiTheme="minorHAnsi"/>
-          <w:noProof/>
-          <w:kern w:val="2"/>
-          <w:sz w:val="24"/>
-          <w:szCs w:val="24"/>
-          <w14:ligatures w14:val="standardContextual"/>
-        </w:rPr>
-      </w:pPr>
-      <w:hyperlink w:anchor="_Toc243091462" w:history="1">
-        <w:r>
-          <w:rPr>
-            <w:rStyle w:val="Siuktni"/>
-            <w:noProof/>
-          </w:rPr>
-          <w:t>5.2. Một số lưu ý và cách xử lý</w:t>
-        </w:r>
-        <w:r>
-          <w:rPr>
-            <w:noProof/>
-            <w:webHidden/>
-          </w:rPr>
-          <w:tab/>
-        </w:r>
-        <w:r>
-          <w:rPr>
-            <w:noProof/>
-            <w:webHidden/>
-          </w:rPr>
-          <w:fldChar w:fldCharType="begin"/>
-        </w:r>
-        <w:r>
-          <w:rPr>
-            <w:noProof/>
-            <w:webHidden/>
-          </w:rPr>
-          <w:instrText xml:space="preserve"> PAGEREF _Toc243091462 \h </w:instrText>
-        </w:r>
-        <w:r>
-          <w:rPr>
-            <w:noProof/>
-            <w:webHidden/>
-          </w:rPr>
-        </w:r>
-        <w:r>
-          <w:rPr>
-            <w:noProof/>
-            <w:webHidden/>
-          </w:rPr>
-          <w:fldChar w:fldCharType="separate"/>
-        </w:r>
-        <w:r>
-          <w:rPr>
-            <w:noProof/>
-            <w:webHidden/>
-          </w:rPr>
-          <w:t>17</w:t>
-        </w:r>
-        <w:r>
-          <w:rPr>
-            <w:noProof/>
-            <w:webHidden/>
-          </w:rPr>
-          <w:fldChar w:fldCharType="end"/>
-        </w:r>
-      </w:hyperlink>
-    </w:p>
-    <w:p>
-      <w:pPr>
-        <w:pStyle w:val="Mucluc2"/>
-        <w:tabs>
-          <w:tab w:val="right" w:leader="dot" w:pos="9061"/>
-        </w:tabs>
-        <w:rPr>
-          <w:rFonts w:asciiTheme="minorHAnsi" w:eastAsiaTheme="minorEastAsia" w:hAnsiTheme="minorHAnsi"/>
-          <w:noProof/>
-          <w:kern w:val="2"/>
-          <w:sz w:val="24"/>
-          <w:szCs w:val="24"/>
-          <w14:ligatures w14:val="standardContextual"/>
-        </w:rPr>
-      </w:pPr>
-      <w:hyperlink w:anchor="_Toc243091463" w:history="1">
-        <w:r>
-          <w:rPr>
-            <w:rStyle w:val="Siuktni"/>
-            <w:noProof/>
-          </w:rPr>
-          <w:t>5.3. Hướng phát triển</w:t>
-        </w:r>
-        <w:r>
-          <w:rPr>
-            <w:noProof/>
-            <w:webHidden/>
-          </w:rPr>
-          <w:tab/>
-        </w:r>
-        <w:r>
-          <w:rPr>
-            <w:noProof/>
-            <w:webHidden/>
-          </w:rPr>
-          <w:fldChar w:fldCharType="begin"/>
-        </w:r>
-        <w:r>
-          <w:rPr>
-            <w:noProof/>
-            <w:webHidden/>
-          </w:rPr>
-          <w:instrText xml:space="preserve"> PAGEREF _Toc243091463 \h </w:instrText>
-        </w:r>
-        <w:r>
-          <w:rPr>
-            <w:noProof/>
-            <w:webHidden/>
-          </w:rPr>
-        </w:r>
-        <w:r>
-          <w:rPr>
-            <w:noProof/>
-            <w:webHidden/>
-          </w:rPr>
-          <w:fldChar w:fldCharType="separate"/>
-        </w:r>
-        <w:r>
-          <w:rPr>
-            <w:noProof/>
-            <w:webHidden/>
-          </w:rPr>
-          <w:t>18</w:t>
-        </w:r>
-        <w:r>
-          <w:rPr>
-            <w:noProof/>
-            <w:webHidden/>
-          </w:rPr>
-          <w:fldChar w:fldCharType="end"/>
-        </w:r>
-      </w:hyperlink>
-    </w:p>
-    <w:p>
-      <w:pPr>
-        <w:pStyle w:val="Mucluc2"/>
-        <w:tabs>
-          <w:tab w:val="right" w:leader="dot" w:pos="9061"/>
-        </w:tabs>
-        <w:rPr>
-          <w:rFonts w:asciiTheme="minorHAnsi" w:eastAsiaTheme="minorEastAsia" w:hAnsiTheme="minorHAnsi"/>
-          <w:noProof/>
-          <w:kern w:val="2"/>
-          <w:sz w:val="24"/>
-          <w:szCs w:val="24"/>
-          <w14:ligatures w14:val="standardContextual"/>
-        </w:rPr>
-      </w:pPr>
-      <w:hyperlink w:anchor="_Toc243091464" w:history="1">
-        <w:r>
-          <w:rPr>
-            <w:rStyle w:val="Siuktni"/>
-            <w:noProof/>
-          </w:rPr>
-          <w:t>5.4. Kết luận</w:t>
-        </w:r>
-        <w:r>
-          <w:rPr>
-            <w:noProof/>
-            <w:webHidden/>
-          </w:rPr>
-          <w:tab/>
-        </w:r>
-        <w:r>
-          <w:rPr>
-            <w:noProof/>
-            <w:webHidden/>
-          </w:rPr>
-          <w:fldChar w:fldCharType="begin"/>
-        </w:r>
-        <w:r>
-          <w:rPr>
-            <w:noProof/>
-            <w:webHidden/>
-          </w:rPr>
-          <w:instrText xml:space="preserve"> PAGEREF _Toc243091464 \h </w:instrText>
-        </w:r>
-        <w:r>
-          <w:rPr>
-            <w:noProof/>
-            <w:webHidden/>
-          </w:rPr>
-        </w:r>
-        <w:r>
-          <w:rPr>
-            <w:noProof/>
-            <w:webHidden/>
-          </w:rPr>
-          <w:fldChar w:fldCharType="separate"/>
-        </w:r>
-        <w:r>
-          <w:rPr>
-            <w:noProof/>
-            <w:webHidden/>
-          </w:rPr>
-          <w:t>18</w:t>
-        </w:r>
-        <w:r>
-          <w:rPr>
-            <w:noProof/>
-            <w:webHidden/>
-          </w:rPr>
-          <w:fldChar w:fldCharType="end"/>
-        </w:r>
-      </w:hyperlink>
-    </w:p>
-    <w:p>
-      <w:pPr>
-        <w:pStyle w:val="Mucluc1"/>
-        <w:tabs>
-          <w:tab w:val="right" w:leader="dot" w:pos="9061"/>
-        </w:tabs>
-        <w:rPr>
-          <w:rFonts w:asciiTheme="minorHAnsi" w:eastAsiaTheme="minorEastAsia" w:hAnsiTheme="minorHAnsi"/>
-          <w:noProof/>
-          <w:kern w:val="2"/>
-          <w:sz w:val="24"/>
-          <w:szCs w:val="24"/>
-          <w14:ligatures w14:val="standardContextual"/>
-        </w:rPr>
-      </w:pPr>
-      <w:hyperlink w:anchor="_Toc243091465" w:history="1">
-        <w:r>
-          <w:rPr>
-            <w:rStyle w:val="Siuktni"/>
-            <w:noProof/>
-          </w:rPr>
-          <w:t>TÀI LIỆU THAM KHẢO</w:t>
-        </w:r>
-        <w:r>
-          <w:rPr>
-            <w:noProof/>
-            <w:webHidden/>
-          </w:rPr>
-          <w:tab/>
-        </w:r>
-        <w:r>
-          <w:rPr>
-            <w:noProof/>
-            <w:webHidden/>
-          </w:rPr>
-          <w:fldChar w:fldCharType="begin"/>
-        </w:r>
-        <w:r>
-          <w:rPr>
-            <w:noProof/>
-            <w:webHidden/>
-          </w:rPr>
-          <w:instrText xml:space="preserve"> PAGEREF _Toc243091465 \h </w:instrText>
+          <w:instrText xml:space="preserve"> PAGEREF _Toc243114681 \h </w:instrText>
         </w:r>
         <w:r>
           <w:rPr>
@@ -1874,7 +1728,7 @@
       <w:r>
         <w:fldChar w:fldCharType="separate"/>
       </w:r>
-      <w:hyperlink w:anchor="_Toc243091466" w:history="1">
+      <w:hyperlink w:anchor="_Toc243114682" w:history="1">
         <w:r>
           <w:rPr>
             <w:rStyle w:val="Siuktni"/>
@@ -1901,7 +1755,7 @@
             <w:noProof/>
             <w:webHidden/>
           </w:rPr>
-          <w:instrText xml:space="preserve"> PAGEREF _Toc243091466 \h </w:instrText>
+          <w:instrText xml:space="preserve"> PAGEREF _Toc243114682 \h </w:instrText>
         </w:r>
         <w:r>
           <w:rPr>
@@ -1947,7 +1801,7 @@
           <w14:ligatures w14:val="standardContextual"/>
         </w:rPr>
       </w:pPr>
-      <w:hyperlink w:anchor="_Toc243091467" w:history="1">
+      <w:hyperlink w:anchor="_Toc243114683" w:history="1">
         <w:r>
           <w:rPr>
             <w:rStyle w:val="Siuktni"/>
@@ -1974,7 +1828,7 @@
             <w:noProof/>
             <w:webHidden/>
           </w:rPr>
-          <w:instrText xml:space="preserve"> PAGEREF _Toc243091467 \h </w:instrText>
+          <w:instrText xml:space="preserve"> PAGEREF _Toc243114683 \h </w:instrText>
         </w:r>
         <w:r>
           <w:rPr>
@@ -2020,7 +1874,7 @@
           <w14:ligatures w14:val="standardContextual"/>
         </w:rPr>
       </w:pPr>
-      <w:hyperlink w:anchor="_Toc243091468" w:history="1">
+      <w:hyperlink w:anchor="_Toc243114684" w:history="1">
         <w:r>
           <w:rPr>
             <w:rStyle w:val="Siuktni"/>
@@ -2047,7 +1901,7 @@
             <w:noProof/>
             <w:webHidden/>
           </w:rPr>
-          <w:instrText xml:space="preserve"> PAGEREF _Toc243091468 \h </w:instrText>
+          <w:instrText xml:space="preserve"> PAGEREF _Toc243114684 \h </w:instrText>
         </w:r>
         <w:r>
           <w:rPr>
@@ -2093,7 +1947,7 @@
           <w14:ligatures w14:val="standardContextual"/>
         </w:rPr>
       </w:pPr>
-      <w:hyperlink w:anchor="_Toc243091469" w:history="1">
+      <w:hyperlink w:anchor="_Toc243114685" w:history="1">
         <w:r>
           <w:rPr>
             <w:rStyle w:val="Siuktni"/>
@@ -2120,7 +1974,7 @@
             <w:noProof/>
             <w:webHidden/>
           </w:rPr>
-          <w:instrText xml:space="preserve"> PAGEREF _Toc243091469 \h </w:instrText>
+          <w:instrText xml:space="preserve"> PAGEREF _Toc243114685 \h </w:instrText>
         </w:r>
         <w:r>
           <w:rPr>
@@ -2166,7 +2020,7 @@
           <w14:ligatures w14:val="standardContextual"/>
         </w:rPr>
       </w:pPr>
-      <w:hyperlink w:anchor="_Toc243091470" w:history="1">
+      <w:hyperlink w:anchor="_Toc243114686" w:history="1">
         <w:r>
           <w:rPr>
             <w:rStyle w:val="Siuktni"/>
@@ -2193,7 +2047,7 @@
             <w:noProof/>
             <w:webHidden/>
           </w:rPr>
-          <w:instrText xml:space="preserve"> PAGEREF _Toc243091470 \h </w:instrText>
+          <w:instrText xml:space="preserve"> PAGEREF _Toc243114686 \h </w:instrText>
         </w:r>
         <w:r>
           <w:rPr>
@@ -2239,7 +2093,7 @@
           <w14:ligatures w14:val="standardContextual"/>
         </w:rPr>
       </w:pPr>
-      <w:hyperlink w:anchor="_Toc243091471" w:history="1">
+      <w:hyperlink w:anchor="_Toc243114687" w:history="1">
         <w:r>
           <w:rPr>
             <w:rStyle w:val="Siuktni"/>
@@ -2266,7 +2120,7 @@
             <w:noProof/>
             <w:webHidden/>
           </w:rPr>
-          <w:instrText xml:space="preserve"> PAGEREF _Toc243091471 \h </w:instrText>
+          <w:instrText xml:space="preserve"> PAGEREF _Toc243114687 \h </w:instrText>
         </w:r>
         <w:r>
           <w:rPr>
@@ -2306,22 +2160,10 @@
       <w:pPr>
         <w:pStyle w:val="u1"/>
       </w:pPr>
-      <w:bookmarkStart w:id="0" w:name="_Toc243091444"/>
+      <w:bookmarkStart w:id="0" w:name="_Toc243114662"/>
       <w:r>
         <w:lastRenderedPageBreak/>
-        <w:t>CHƯƠNG 1. GI</w:t>
-      </w:r>
-      <w:r>
-        <w:t>Ớ</w:t>
-      </w:r>
-      <w:r>
-        <w:t>I THI</w:t>
-      </w:r>
-      <w:r>
-        <w:t>Ệ</w:t>
-      </w:r>
-      <w:r>
-        <w:t>U</w:t>
+        <w:t>CHƯƠNG 1. GIỚI THIỆU</w:t>
       </w:r>
       <w:bookmarkEnd w:id="0"/>
     </w:p>
@@ -2329,33 +2171,9 @@
       <w:pPr>
         <w:pStyle w:val="u2"/>
       </w:pPr>
-      <w:bookmarkStart w:id="1" w:name="_Toc243091445"/>
+      <w:bookmarkStart w:id="1" w:name="_Toc243114663"/>
       <w:r>
-        <w:t>1.1. B</w:t>
-      </w:r>
-      <w:r>
-        <w:t>ố</w:t>
-      </w:r>
-      <w:r>
-        <w:t>i c</w:t>
-      </w:r>
-      <w:r>
-        <w:t>ả</w:t>
-      </w:r>
-      <w:r>
-        <w:t>nh và lý do th</w:t>
-      </w:r>
-      <w:r>
-        <w:t>ự</w:t>
-      </w:r>
-      <w:r>
-        <w:t>c hi</w:t>
-      </w:r>
-      <w:r>
-        <w:t>ệ</w:t>
-      </w:r>
-      <w:r>
-        <w:t>n</w:t>
+        <w:t>1.1. Bối cảnh và lý do thực hiện</w:t>
       </w:r>
       <w:bookmarkEnd w:id="1"/>
     </w:p>
@@ -2372,28 +2190,16 @@
         <w:rPr>
           <w:color w:val="000000"/>
         </w:rPr>
-        <w:t>Để áp dụng DevOps, người kỹ sư cần làm chủ một chuỗi công cụ: môi trường Linux để làm việc với dòng lệnh, giao thức SSH để điều khiển máy từ xa, container (Docker) để đóng gói ứng dụng cùng phụ thuộc vào một image và chạy đồng nhất ở mọi nơi, kho image để phân phối bản build, và máy chủ tự động hóa (Jenkins) để xây dựng quy trình CI/CD — mỗi lần có commit mới, hệ thống sẽ tự build, tự kiểm thử và tự triển khai. Báo cáo này ghi lại quá trình thực hành trên một máy Windows cá nhân với hai nhóm công việc chính</w:t>
-      </w:r>
-      <w:r>
-        <w:rPr>
-          <w:color w:val="000000"/>
-        </w:rPr>
-        <w:t>: thao tác Docker với docker-compose và xây pipeline Jenkins cho dự án quản lý sinh viên.</w:t>
+        <w:t>Để áp dụng DevOps, người kỹ sư cần làm chủ một chuỗi công cụ: container (Docker) để đóng gói ứng dụng cùng toàn bộ phụ thuộc vào một image và chạy đồng nhất ở mọi nơi, kho image (Docker Hub, GHCR) để phân phối bản build, và máy chủ tự động hóa (Jenkins) để xây dựng quy trình CI/CD — mỗi lần có commit mới, hệ thống sẽ tự build, tự kiểm thử và tự triển khai. Báo cáo này ghi lại quá trình thực hành trên một máy Windows cá nhân với hai nhóm công việc chính: thao tác Docker với docker-compose và xây pipeline Jenkins cho dự án quản lý sinh viên.</w:t>
       </w:r>
     </w:p>
     <w:p>
       <w:pPr>
         <w:pStyle w:val="u2"/>
       </w:pPr>
-      <w:bookmarkStart w:id="2" w:name="_Toc243091446"/>
+      <w:bookmarkStart w:id="2" w:name="_Toc243114664"/>
       <w:r>
-        <w:t>1.2. M</w:t>
-      </w:r>
-      <w:r>
-        <w:t>ụ</w:t>
-      </w:r>
-      <w:r>
-        <w:t>c tiêu</w:t>
+        <w:t>1.2. Mục tiêu</w:t>
       </w:r>
       <w:bookmarkEnd w:id="2"/>
     </w:p>
@@ -2464,33 +2270,9 @@
       <w:pPr>
         <w:pStyle w:val="u2"/>
       </w:pPr>
-      <w:bookmarkStart w:id="3" w:name="_Toc243091447"/>
+      <w:bookmarkStart w:id="3" w:name="_Toc243114665"/>
       <w:r>
-        <w:t>1.3. Ph</w:t>
-      </w:r>
-      <w:r>
-        <w:t>ạ</w:t>
-      </w:r>
-      <w:r>
-        <w:t>m vi và n</w:t>
-      </w:r>
-      <w:r>
-        <w:t>ộ</w:t>
-      </w:r>
-      <w:r>
-        <w:t>i dung th</w:t>
-      </w:r>
-      <w:r>
-        <w:t>ự</w:t>
-      </w:r>
-      <w:r>
-        <w:t>c hi</w:t>
-      </w:r>
-      <w:r>
-        <w:t>ệ</w:t>
-      </w:r>
-      <w:r>
-        <w:t>n</w:t>
+        <w:t>1.3. Phạm vi và nội dung thực hiện</w:t>
       </w:r>
       <w:bookmarkEnd w:id="3"/>
     </w:p>
@@ -2499,29 +2281,7 @@
         <w:rPr>
           <w:color w:val="000000"/>
         </w:rPr>
-        <w:t xml:space="preserve">Phạm vi thực hành gồm hai nhóm công việc: (1) bài thực hành Docker với một ứng dụng web nhỏ trong thư mục docker-lab, image được đẩy lên Docker Hub; (2) xây pipeline Jenkins cho dự án Student Management System trên nhánh DanhTai của kho </w:t>
-      </w:r>
-      <w:r>
-        <w:rPr>
-          <w:color w:val="000000"/>
-        </w:rPr>
-        <w:lastRenderedPageBreak/>
-        <w:t>mã nguồn GitHub. Kết quả được minh chứng bằng ảnh chụp màn hình và console output của Jenkins.</w:t>
-      </w:r>
-    </w:p>
-    <w:p>
-      <w:r>
-        <w:rPr>
-          <w:b/>
-          <w:color w:val="000000"/>
-        </w:rPr>
-        <w:t xml:space="preserve">Lưu ý: </w:t>
-      </w:r>
-      <w:r>
-        <w:rPr>
-          <w:color w:val="000000"/>
-        </w:rPr>
-        <w:t>phần thực hành cài đặt Ubuntu trên WSL và kết nối SSH từ Ubuntu vào Windows đã được tiến hành nhưng gặp lỗi trong quá trình cấu hình, không đạt được kết quả mong muốn; theo hướng dẫn, phần này được lược bỏ khỏi báo cáo. Vì vậy nội dung thực hành còn lại tập trung vào Docker (mục 4.1–4.3) và Jenkins (mục 4.4).</w:t>
+        <w:t>Phạm vi thực hành gồm hai nhóm công việc: (1) bài thực hành Docker với một ứng dụng web nhỏ trong thư mục docker-lab, image được đẩy lên Docker Hub; (2) xây pipeline Jenkins cho dự án Student Management System trên nhánh DanhTai của kho mã nguồn GitHub. Kết quả được minh chứng bằng ảnh chụp màn hình và console output của Jenkins.</w:t>
       </w:r>
     </w:p>
     <w:p>
@@ -2529,6 +2289,7 @@
         <w:rPr>
           <w:color w:val="000000"/>
         </w:rPr>
+        <w:lastRenderedPageBreak/>
         <w:t>Toàn bộ kết quả thực hành được trình bày tuần tự tại Chương 4, gồm bốn nội dung: tạo docker-compose.yml và chạy lần đầu; kiểm tra container, push image và build lại; hoàn tất push bản mới và kiểm tra kết quả; viết Jenkins cho dự án.</w:t>
       </w:r>
     </w:p>
@@ -2536,22 +2297,10 @@
       <w:pPr>
         <w:pStyle w:val="u1"/>
       </w:pPr>
-      <w:bookmarkStart w:id="4" w:name="_Toc243091448"/>
+      <w:bookmarkStart w:id="4" w:name="_Toc243114666"/>
       <w:r>
         <w:lastRenderedPageBreak/>
-        <w:t>CHƯƠNG 2. CƠ S</w:t>
-      </w:r>
-      <w:r>
-        <w:t>Ở</w:t>
-      </w:r>
-      <w:r>
-        <w:t xml:space="preserve"> LÝ THUY</w:t>
-      </w:r>
-      <w:r>
-        <w:t>Ế</w:t>
-      </w:r>
-      <w:r>
-        <w:t>T</w:t>
+        <w:t>CHƯƠNG 2. CƠ SỞ LÝ THUYẾT</w:t>
       </w:r>
       <w:bookmarkEnd w:id="4"/>
     </w:p>
@@ -2559,7 +2308,7 @@
       <w:pPr>
         <w:pStyle w:val="u2"/>
       </w:pPr>
-      <w:bookmarkStart w:id="5" w:name="_Toc243091449"/>
+      <w:bookmarkStart w:id="5" w:name="_Toc243114667"/>
       <w:r>
         <w:t>2.1. DevOps và CI/CD</w:t>
       </w:r>
@@ -2578,22 +2327,16 @@
         <w:rPr>
           <w:color w:val="000000"/>
         </w:rPr>
-        <w:t>CI (Continuous Integration — Tích hợp liên tục) là thực hành mà lập trình viên thường xuyên hợp nhất mã nguồn vào nhánh chung; mỗi lần hợp nhất, hệ thống tự động build và chạy kiểm thử để phát hiện lỗi sớm. CD (Continuous Delivery/Deployment — Chuyển giao/Triển khai liên tục) mở rộng CI bằng việc tự động đưa bản build đạt yêu cầu đến môi trường kiểm thử hoặc môi trường thực. Một pipeline CI/CD điển hình gồm các giai đoạn: lấy mã nguồn (Checkout), biên dịch/đóng gói (Build), kiểm thử (Test), đóng gói contain</w:t>
-      </w:r>
-      <w:r>
-        <w:rPr>
-          <w:color w:val="000000"/>
-        </w:rPr>
-        <w:t>er (Package) và triển khai (Deploy).</w:t>
+        <w:t>CI (Continuous Integration — Tích hợp liên tục) là thực hành mà lập trình viên thường xuyên hợp nhất mã nguồn vào nhánh chung; mỗi lần hợp nhất, hệ thống tự động build và chạy kiểm thử để phát hiện lỗi sớm. CD (Continuous Delivery/Deployment — Chuyển giao/Triển khai liên tục) mở rộng CI bằng việc tự động đưa bản build đạt yêu cầu đến môi trường kiểm thử hoặc môi trường thực. Một pipeline CI/CD điển hình gồm các giai đoạn: lấy mã nguồn (Checkout), biên dịch/đóng gói (Build), kiểm thử (Test), đóng gói container (Package) và triển khai (Deploy).</w:t>
       </w:r>
     </w:p>
     <w:p>
       <w:pPr>
         <w:pStyle w:val="u2"/>
       </w:pPr>
-      <w:bookmarkStart w:id="6" w:name="_Toc243091450"/>
+      <w:bookmarkStart w:id="6" w:name="_Toc243114668"/>
       <w:r>
-        <w:t>2.2. WSL - Windows Subsystem for Linux</w:t>
+        <w:t>2.2. Docker và container</w:t>
       </w:r>
       <w:bookmarkEnd w:id="6"/>
     </w:p>
@@ -2602,56 +2345,7 @@
         <w:rPr>
           <w:color w:val="000000"/>
         </w:rPr>
-        <w:t>WSL cho phép chạy môi trường Linux thật ngay trên Windows mà không cần cài song song hai hệ điều hành. Ở phiên bản WSL2, nhân Linux được Microsoft đóng gói trong một máy ảo siêu nhỏ, nên tương thích tốt với các công cụ như Docker. Các bản phân phối Linux được cài từ Microsoft Store hoặc bằng lệnh wsl --install; ổ đĩa Windows được gắn tự động vào Linux dưới thư mục /mnt/c, /mnt/d..., giúp hai hệ điều hành chia sẻ tệp dễ dàng. Thực hành cài đặt Ubuntu trên WSL đã được tiến hành nhưng gặp lỗi, chưa đạt kết quả</w:t>
-      </w:r>
-      <w:r>
-        <w:rPr>
-          <w:color w:val="000000"/>
-        </w:rPr>
-        <w:t xml:space="preserve"> (đã nêu tại mục 1.3) nên không có hình ảnh minh chứng trong báo cáo.</w:t>
-      </w:r>
-    </w:p>
-    <w:p>
-      <w:pPr>
-        <w:pStyle w:val="u2"/>
-      </w:pPr>
-      <w:bookmarkStart w:id="7" w:name="_Toc243091451"/>
-      <w:r>
-        <w:t>2.3. SSH - Secure Shell</w:t>
-      </w:r>
-      <w:bookmarkEnd w:id="7"/>
-    </w:p>
-    <w:p>
-      <w:r>
-        <w:rPr>
-          <w:color w:val="000000"/>
-        </w:rPr>
-        <w:t>SSH là giao thức mạng mã hóa dùng để đăng nhập và thực thi lệnh trên máy từ xa một cách an toàn, hoạt động theo mô hình client-server: máy chủ chạy dịch vụ sshd (mặc định cổng 22), máy khách dùng lệnh ssh user@host để kết nối; việc xác thực có thể bằng mật khẩu hoặc bằng cặp khóa công khai/bí mật. Trong môi trường DevOps, SSH là cách phổ biến để kỹ sư điều khiển các máy chủ từ xa chỉ bằng dòng lệnh. Tương tự mục WSL, phần thực hành SSH từ Ubuntu vào Windows gặp lỗi nên được lược bỏ theo lưu ý tại mục 1.3.</w:t>
-      </w:r>
-    </w:p>
-    <w:p>
-      <w:pPr>
-        <w:pStyle w:val="u2"/>
-      </w:pPr>
-      <w:bookmarkStart w:id="8" w:name="_Toc243091452"/>
-      <w:r>
-        <w:t>2.4. Docker và container</w:t>
-      </w:r>
-      <w:bookmarkEnd w:id="8"/>
-    </w:p>
-    <w:p>
-      <w:r>
-        <w:rPr>
-          <w:color w:val="000000"/>
-        </w:rPr>
-        <w:t xml:space="preserve">Docker là nền tảng đóng gói ứng dụng cùng toàn bộ thư viện và cấu hình cần thiết vào một image; từ image có thể khởi chạy nhiều container — các tiến trình được cách ly nhưng dùng chung nhân hệ điều hành host nên rất nhẹ và khởi động nhanh. Nhờ đó, </w:t>
-      </w:r>
-      <w:r>
-        <w:rPr>
-          <w:color w:val="000000"/>
-        </w:rPr>
-        <w:lastRenderedPageBreak/>
-        <w:t>ứng dụng chạy giống nhau trên máy lập trình viên, máy kiểm thử và máy chủ thật. Image được quản lý qua các tag (ví dụ latest, hay tag theo commit) và lưu tại các registry như Docker Hub hay GitHub Container Registry (GHCR); Alpine Linux thường được dùng làm image nền vì cực kỳ nhỏ gọn.</w:t>
+        <w:t>Docker là nền tảng đóng gói ứng dụng cùng toàn bộ thư viện và cấu hình cần thiết vào một image; từ image có thể khởi chạy nhiều container — các tiến trình được cách ly nhưng dùng chung nhân hệ điều hành host nên rất nhẹ và khởi động nhanh. Nhờ đó, ứng dụng chạy giống nhau trên máy lập trình viên, máy kiểm thử và máy chủ thật. Image được quản lý qua các tag (ví dụ latest, hay tag theo commit) và lưu tại các registry như Docker Hub hay GitHub Container Registry (GHCR); Alpine Linux thường được dùng làm image nền vì cực kỳ nhỏ gọn.</w:t>
       </w:r>
     </w:p>
     <w:p>
@@ -2666,54 +2360,37 @@
       <w:pPr>
         <w:pStyle w:val="u2"/>
       </w:pPr>
-      <w:bookmarkStart w:id="9" w:name="_Toc243091453"/>
+      <w:bookmarkStart w:id="7" w:name="_Toc243114669"/>
       <w:r>
-        <w:t>2.5. Jenkins</w:t>
+        <w:t>2.3. Jenkins</w:t>
       </w:r>
-      <w:bookmarkEnd w:id="9"/>
+      <w:bookmarkEnd w:id="7"/>
     </w:p>
     <w:p>
       <w:r>
         <w:rPr>
           <w:color w:val="000000"/>
         </w:rPr>
-        <w:t xml:space="preserve">Jenkins là máy chủ tự động hóa mã nguồn mở, được dùng phổ biến để xây dựng pipeline CI/CD. Jenkins có hệ sinh thái plugin phong phú (Git, Docker, Pipeline, Credentials...), hỗ trợ định nghĩa quy trình bằng mã thông qua tệp Jenkinsfile theo kiểu Declarative hoặc Scripted. Mỗi lần chạy pipeline được gọi là một build và được đánh số tăng dần (#1, #2, ...). Quy trình có thể được kích hoạt bằng webhook từ GitHub hoặc bằng Poll SCM — Jenkins định kỳ dò xem kho mã nguồn có commit mới hay không. Thông tin nhạy cảm </w:t>
+        <w:t xml:space="preserve">Jenkins là máy chủ tự động hóa mã nguồn mở, được dùng phổ biến để xây dựng pipeline CI/CD. Jenkins có hệ sinh thái plugin phong phú (Git, Docker, Pipeline, Credentials...), hỗ trợ định nghĩa quy trình bằng mã thông qua tệp Jenkinsfile theo kiểu Declarative hoặc Scripted. Mỗi lần chạy pipeline được gọi là một build và được đánh số tăng dần (#1, #2, ...). Quy trình có thể được kích hoạt bằng webhook từ GitHub hoặc bằng Poll SCM — Jenkins định kỳ dò xem kho mã nguồn có commit mới hay </w:t>
       </w:r>
       <w:r>
         <w:rPr>
           <w:color w:val="000000"/>
         </w:rPr>
-        <w:t>như token registry được lưu bằng tính năng Credentials của Jenkins và chỉ được giải nén ra môi trường trong lúc chạy.</w:t>
+        <w:lastRenderedPageBreak/>
+        <w:t>không. Thông tin nhạy cảm như token registry được lưu bằng tính năng Credentials của Jenkins và chỉ được giải nén ra môi trường trong lúc chạy.</w:t>
       </w:r>
     </w:p>
     <w:p>
       <w:pPr>
         <w:pStyle w:val="u1"/>
       </w:pPr>
-      <w:bookmarkStart w:id="10" w:name="_Toc243091454"/>
+      <w:bookmarkStart w:id="8" w:name="_Toc243114670"/>
       <w:r>
         <w:lastRenderedPageBreak/>
-        <w:t>CHƯƠNG 3. MÔI TRƯ</w:t>
+        <w:t>CHƯƠNG 3. MÔI TRƯỜNG THỰC HIỆN</w:t>
       </w:r>
-      <w:r>
-        <w:t>Ờ</w:t>
-      </w:r>
-      <w:r>
-        <w:t>NG TH</w:t>
-      </w:r>
-      <w:r>
-        <w:t>Ự</w:t>
-      </w:r>
-      <w:r>
-        <w:t>C HI</w:t>
-      </w:r>
-      <w:r>
-        <w:t>Ệ</w:t>
-      </w:r>
-      <w:r>
-        <w:t>N</w:t>
-      </w:r>
-      <w:bookmarkEnd w:id="10"/>
+      <w:bookmarkEnd w:id="8"/>
     </w:p>
     <w:p>
       <w:r>
@@ -2868,65 +2545,6 @@
                 <w:sz w:val="24"/>
               </w:rPr>
               <w:t>Thông tin hệ thống Windows</w:t>
-            </w:r>
-          </w:p>
-        </w:tc>
-      </w:tr>
-      <w:tr>
-        <w:trPr>
-          <w:jc w:val="center"/>
-        </w:trPr>
-        <w:tc>
-          <w:tcPr>
-            <w:tcW w:w="2154" w:type="dxa"/>
-          </w:tcPr>
-          <w:p>
-            <w:pPr>
-              <w:spacing w:after="0"/>
-              <w:jc w:val="left"/>
-            </w:pPr>
-            <w:r>
-              <w:rPr>
-                <w:color w:val="000000"/>
-                <w:sz w:val="24"/>
-              </w:rPr>
-              <w:t>WSL</w:t>
-            </w:r>
-          </w:p>
-        </w:tc>
-        <w:tc>
-          <w:tcPr>
-            <w:tcW w:w="4649" w:type="dxa"/>
-          </w:tcPr>
-          <w:p>
-            <w:pPr>
-              <w:spacing w:after="0"/>
-              <w:jc w:val="left"/>
-            </w:pPr>
-            <w:r>
-              <w:rPr>
-                <w:color w:val="000000"/>
-                <w:sz w:val="24"/>
-              </w:rPr>
-              <w:t>WSL2 — Ubuntu đã cài đặt (trạng thái Stopped); thực hành gặp lỗi nên lược (mục 1.3)</w:t>
-            </w:r>
-          </w:p>
-        </w:tc>
-        <w:tc>
-          <w:tcPr>
-            <w:tcW w:w="2268" w:type="dxa"/>
-          </w:tcPr>
-          <w:p>
-            <w:pPr>
-              <w:spacing w:after="0"/>
-              <w:jc w:val="left"/>
-            </w:pPr>
-            <w:r>
-              <w:rPr>
-                <w:color w:val="000000"/>
-                <w:sz w:val="24"/>
-              </w:rPr>
-              <w:t>Lệnh wsl -l -v</w:t>
             </w:r>
           </w:p>
         </w:tc>
@@ -3295,80 +2913,29 @@
       <w:pPr>
         <w:pStyle w:val="u1"/>
       </w:pPr>
-      <w:bookmarkStart w:id="11" w:name="_Toc243091455"/>
+      <w:bookmarkStart w:id="9" w:name="_Toc243114671"/>
       <w:r>
         <w:lastRenderedPageBreak/>
-        <w:t>CHƯƠNG 4. TRI</w:t>
+        <w:t>CHƯƠNG 4. TRIỂN KHAI THỰC HIỆN</w:t>
       </w:r>
-      <w:r>
-        <w:t>Ể</w:t>
-      </w:r>
-      <w:r>
-        <w:t>N KHAI TH</w:t>
-      </w:r>
-      <w:r>
-        <w:t>Ự</w:t>
-      </w:r>
-      <w:r>
-        <w:t>C HI</w:t>
-      </w:r>
-      <w:r>
-        <w:t>Ệ</w:t>
-      </w:r>
-      <w:r>
-        <w:t>N</w:t>
-      </w:r>
-      <w:bookmarkEnd w:id="11"/>
+      <w:bookmarkEnd w:id="9"/>
     </w:p>
     <w:p>
       <w:pPr>
         <w:pStyle w:val="u2"/>
       </w:pPr>
-      <w:bookmarkStart w:id="12" w:name="_Toc243091456"/>
+      <w:bookmarkStart w:id="10" w:name="_Toc243114672"/>
       <w:r>
-        <w:t>4.1. T</w:t>
+        <w:t>4.1. Tạo docker-compose.yml và chạy lần đầu</w:t>
       </w:r>
-      <w:r>
-        <w:t>ạ</w:t>
-      </w:r>
-      <w:r>
-        <w:t>o docker-compose.yml và ch</w:t>
-      </w:r>
-      <w:r>
-        <w:t>ạ</w:t>
-      </w:r>
-      <w:r>
-        <w:t>y l</w:t>
-      </w:r>
-      <w:r>
-        <w:t>ầ</w:t>
-      </w:r>
-      <w:r>
-        <w:t>n đ</w:t>
-      </w:r>
-      <w:r>
-        <w:t>ầ</w:t>
-      </w:r>
-      <w:r>
-        <w:t>u</w:t>
-      </w:r>
-      <w:bookmarkEnd w:id="12"/>
+      <w:bookmarkEnd w:id="10"/>
     </w:p>
     <w:p>
       <w:pPr>
         <w:pStyle w:val="u3"/>
       </w:pPr>
       <w:r>
-        <w:t>A. Chu</w:t>
-      </w:r>
-      <w:r>
-        <w:t>ẩ</w:t>
-      </w:r>
-      <w:r>
-        <w:t>n b</w:t>
-      </w:r>
-      <w:r>
-        <w:t>ị</w:t>
+        <w:t>A. Chuẩn bị</w:t>
       </w:r>
     </w:p>
     <w:p>
@@ -3464,19 +3031,7 @@
         <w:pStyle w:val="u3"/>
       </w:pPr>
       <w:r>
-        <w:t>B. Ch</w:t>
-      </w:r>
-      <w:r>
-        <w:t>ạ</w:t>
-      </w:r>
-      <w:r>
-        <w:t>y và ki</w:t>
-      </w:r>
-      <w:r>
-        <w:t>ể</w:t>
-      </w:r>
-      <w:r>
-        <w:t>m tra</w:t>
+        <w:t>B. Chạy và kiểm tra</w:t>
       </w:r>
     </w:p>
     <w:p>
@@ -3935,7 +3490,7 @@
         </w:rPr>
         <w:lastRenderedPageBreak/>
         <w:drawing>
-          <wp:inline distT="0" distB="0" distL="0" distR="0" wp14:anchorId="15EAA8DF" wp14:editId="665D2C7B">
+          <wp:inline distT="0" distB="0" distL="0" distR="0" wp14:anchorId="44319EDD" wp14:editId="3EA86924">
             <wp:extent cx="5220000" cy="2936250"/>
             <wp:effectExtent l="0" t="0" r="0" b="0"/>
             <wp:docPr id="2" name="Picture 2"/>
@@ -3977,11 +3532,11 @@
         <w:spacing w:after="160"/>
         <w:jc w:val="center"/>
       </w:pPr>
-      <w:bookmarkStart w:id="13" w:name="_Toc243091466"/>
+      <w:bookmarkStart w:id="11" w:name="_Toc243114682"/>
       <w:r>
         <w:t>Hình 4.1. Tạo docker-compose.yml và chạy docker compose up -d lần đầu</w:t>
       </w:r>
-      <w:bookmarkEnd w:id="13"/>
+      <w:bookmarkEnd w:id="11"/>
     </w:p>
     <w:p>
       <w:r>
@@ -4002,42 +3557,18 @@
       <w:pPr>
         <w:pStyle w:val="u2"/>
       </w:pPr>
-      <w:bookmarkStart w:id="14" w:name="_Toc243091457"/>
+      <w:bookmarkStart w:id="12" w:name="_Toc243114673"/>
       <w:r>
-        <w:t>4.2. Ki</w:t>
+        <w:t>4.2. Kiểm tra container, push image và build lại</w:t>
       </w:r>
-      <w:r>
-        <w:t>ể</w:t>
-      </w:r>
-      <w:r>
-        <w:t>m tra container, push image và build l</w:t>
-      </w:r>
-      <w:r>
-        <w:t>ạ</w:t>
-      </w:r>
-      <w:r>
-        <w:t>i</w:t>
-      </w:r>
-      <w:bookmarkEnd w:id="14"/>
+      <w:bookmarkEnd w:id="12"/>
     </w:p>
     <w:p>
       <w:pPr>
         <w:pStyle w:val="u3"/>
       </w:pPr>
       <w:r>
-        <w:t>A. Ki</w:t>
-      </w:r>
-      <w:r>
-        <w:t>ể</w:t>
-      </w:r>
-      <w:r>
-        <w:t>m tra container và th</w:t>
-      </w:r>
-      <w:r>
-        <w:t>ử</w:t>
-      </w:r>
-      <w:r>
-        <w:t xml:space="preserve"> push image</w:t>
+        <w:t>A. Kiểm tra container và thử push image</w:t>
       </w:r>
     </w:p>
     <w:p>
@@ -4053,25 +3584,7 @@
         <w:pStyle w:val="u3"/>
       </w:pPr>
       <w:r>
-        <w:t>B. Build l</w:t>
-      </w:r>
-      <w:r>
-        <w:t>ạ</w:t>
-      </w:r>
-      <w:r>
-        <w:t>i image theo c</w:t>
-      </w:r>
-      <w:r>
-        <w:t>ấ</w:t>
-      </w:r>
-      <w:r>
-        <w:t>u hình m</w:t>
-      </w:r>
-      <w:r>
-        <w:t>ớ</w:t>
-      </w:r>
-      <w:r>
-        <w:t>i</w:t>
+        <w:t>B. Build lại image theo cấu hình mới</w:t>
       </w:r>
     </w:p>
     <w:p>
@@ -4331,7 +3844,7 @@
           <w:noProof/>
         </w:rPr>
         <w:drawing>
-          <wp:inline distT="0" distB="0" distL="0" distR="0" wp14:anchorId="1F8050BD" wp14:editId="18A62546">
+          <wp:inline distT="0" distB="0" distL="0" distR="0" wp14:anchorId="5DD65049" wp14:editId="01D2E1EE">
             <wp:extent cx="5220000" cy="2936250"/>
             <wp:effectExtent l="0" t="0" r="0" b="0"/>
             <wp:docPr id="3" name="Picture 3"/>
@@ -4373,11 +3886,11 @@
         <w:spacing w:after="160"/>
         <w:jc w:val="center"/>
       </w:pPr>
-      <w:bookmarkStart w:id="15" w:name="_Toc243091467"/>
+      <w:bookmarkStart w:id="13" w:name="_Toc243114683"/>
       <w:r>
         <w:t>Hình 4.2. Kiểm tra container, push image và build lại bằng docker compose up -d --build</w:t>
       </w:r>
-      <w:bookmarkEnd w:id="15"/>
+      <w:bookmarkEnd w:id="13"/>
     </w:p>
     <w:p>
       <w:r>
@@ -4398,63 +3911,18 @@
       <w:pPr>
         <w:pStyle w:val="u2"/>
       </w:pPr>
-      <w:bookmarkStart w:id="16" w:name="_Toc243091458"/>
+      <w:bookmarkStart w:id="14" w:name="_Toc243114674"/>
       <w:r>
-        <w:t>4.3. Hoàn t</w:t>
+        <w:t>4.3. Hoàn tất build lại, push bản mới và kết quả</w:t>
       </w:r>
-      <w:r>
-        <w:t>ấ</w:t>
-      </w:r>
-      <w:r>
-        <w:t>t build l</w:t>
-      </w:r>
-      <w:r>
-        <w:t>ạ</w:t>
-      </w:r>
-      <w:r>
-        <w:t>i, push b</w:t>
-      </w:r>
-      <w:r>
-        <w:t>ả</w:t>
-      </w:r>
-      <w:r>
-        <w:t>n m</w:t>
-      </w:r>
-      <w:r>
-        <w:t>ớ</w:t>
-      </w:r>
-      <w:r>
-        <w:t>i và k</w:t>
-      </w:r>
-      <w:r>
-        <w:t>ế</w:t>
-      </w:r>
-      <w:r>
-        <w:t>t qu</w:t>
-      </w:r>
-      <w:r>
-        <w:t>ả</w:t>
-      </w:r>
-      <w:bookmarkEnd w:id="16"/>
+      <w:bookmarkEnd w:id="14"/>
     </w:p>
     <w:p>
       <w:pPr>
         <w:pStyle w:val="u3"/>
       </w:pPr>
       <w:r>
-        <w:t>A. Push b</w:t>
-      </w:r>
-      <w:r>
-        <w:t>ả</w:t>
-      </w:r>
-      <w:r>
-        <w:t>n m</w:t>
-      </w:r>
-      <w:r>
-        <w:t>ớ</w:t>
-      </w:r>
-      <w:r>
-        <w:t>i lên Docker Hub</w:t>
+        <w:t>A. Push bản mới lên Docker Hub</w:t>
       </w:r>
     </w:p>
     <w:p>
@@ -4475,7 +3943,7 @@
           <w:noProof/>
         </w:rPr>
         <w:drawing>
-          <wp:inline distT="0" distB="0" distL="0" distR="0" wp14:anchorId="38F0B443" wp14:editId="05405346">
+          <wp:inline distT="0" distB="0" distL="0" distR="0" wp14:anchorId="12322009" wp14:editId="2803B212">
             <wp:extent cx="5220000" cy="2936250"/>
             <wp:effectExtent l="0" t="0" r="0" b="0"/>
             <wp:docPr id="4" name="Picture 4"/>
@@ -4517,11 +3985,11 @@
         <w:spacing w:after="160"/>
         <w:jc w:val="center"/>
       </w:pPr>
-      <w:bookmarkStart w:id="17" w:name="_Toc243091468"/>
+      <w:bookmarkStart w:id="15" w:name="_Toc243114684"/>
       <w:r>
         <w:t>Hình 4.3. Hoàn tất build lại và push bản mới lên Docker Hub</w:t>
       </w:r>
-      <w:bookmarkEnd w:id="17"/>
+      <w:bookmarkEnd w:id="15"/>
     </w:p>
     <w:p>
       <w:pPr>
@@ -4529,22 +3997,7 @@
       </w:pPr>
       <w:r>
         <w:lastRenderedPageBreak/>
-        <w:t>B. Ki</w:t>
-      </w:r>
-      <w:r>
-        <w:t>ể</w:t>
-      </w:r>
-      <w:r>
-        <w:t>m tra k</w:t>
-      </w:r>
-      <w:r>
-        <w:t>ế</w:t>
-      </w:r>
-      <w:r>
-        <w:t>t qu</w:t>
-      </w:r>
-      <w:r>
-        <w:t>ả</w:t>
+        <w:t>B. Kiểm tra kết quả</w:t>
       </w:r>
     </w:p>
     <w:p>
@@ -4565,7 +4018,7 @@
           <w:noProof/>
         </w:rPr>
         <w:drawing>
-          <wp:inline distT="0" distB="0" distL="0" distR="0" wp14:anchorId="0FC74B3F" wp14:editId="6B9E66CF">
+          <wp:inline distT="0" distB="0" distL="0" distR="0" wp14:anchorId="30D31AE1" wp14:editId="2DBB0860">
             <wp:extent cx="5220000" cy="2936250"/>
             <wp:effectExtent l="0" t="0" r="0" b="0"/>
             <wp:docPr id="5" name="Picture 5"/>
@@ -4607,11 +4060,11 @@
         <w:spacing w:after="160"/>
         <w:jc w:val="center"/>
       </w:pPr>
-      <w:bookmarkStart w:id="18" w:name="_Toc243091469"/>
+      <w:bookmarkStart w:id="16" w:name="_Toc243114685"/>
       <w:r>
         <w:t>Hình 4.4. Giao diện web tại localhost:8000 sau khi build lại</w:t>
       </w:r>
-      <w:bookmarkEnd w:id="18"/>
+      <w:bookmarkEnd w:id="16"/>
     </w:p>
     <w:p>
       <w:pPr>
@@ -4623,7 +4076,7 @@
           <w:noProof/>
         </w:rPr>
         <w:drawing>
-          <wp:inline distT="0" distB="0" distL="0" distR="0" wp14:anchorId="36DAF282" wp14:editId="089640DE">
+          <wp:inline distT="0" distB="0" distL="0" distR="0" wp14:anchorId="7B3D0E28" wp14:editId="70551914">
             <wp:extent cx="5220000" cy="2972102"/>
             <wp:effectExtent l="0" t="0" r="0" b="0"/>
             <wp:docPr id="6" name="Picture 6"/>
@@ -4665,11 +4118,11 @@
         <w:spacing w:after="160"/>
         <w:jc w:val="center"/>
       </w:pPr>
-      <w:bookmarkStart w:id="19" w:name="_Toc243091470"/>
+      <w:bookmarkStart w:id="17" w:name="_Toc243114686"/>
       <w:r>
         <w:t>Hình 4.5. Docker Desktop — danh sách container đang chạy</w:t>
       </w:r>
-      <w:bookmarkEnd w:id="19"/>
+      <w:bookmarkEnd w:id="17"/>
     </w:p>
     <w:p>
       <w:pPr>
@@ -4930,42 +4383,18 @@
       <w:pPr>
         <w:pStyle w:val="u2"/>
       </w:pPr>
-      <w:bookmarkStart w:id="20" w:name="_Toc243091459"/>
+      <w:bookmarkStart w:id="18" w:name="_Toc243114675"/>
       <w:r>
-        <w:t>4.4. Vi</w:t>
+        <w:t>4.4. Viết Jenkins cho dự án</w:t>
       </w:r>
-      <w:r>
-        <w:t>ế</w:t>
-      </w:r>
-      <w:r>
-        <w:t>t Jenkins cho d</w:t>
-      </w:r>
-      <w:r>
-        <w:t>ự</w:t>
-      </w:r>
-      <w:r>
-        <w:t xml:space="preserve"> án</w:t>
-      </w:r>
-      <w:bookmarkEnd w:id="20"/>
+      <w:bookmarkEnd w:id="18"/>
     </w:p>
     <w:p>
       <w:pPr>
         <w:pStyle w:val="u3"/>
       </w:pPr>
       <w:r>
-        <w:t>A. Mô hình CI c</w:t>
-      </w:r>
-      <w:r>
-        <w:t>ủ</w:t>
-      </w:r>
-      <w:r>
-        <w:t>a d</w:t>
-      </w:r>
-      <w:r>
-        <w:t>ự</w:t>
-      </w:r>
-      <w:r>
-        <w:t xml:space="preserve"> án</w:t>
+        <w:t>A. Mô hình CI của dự án</w:t>
       </w:r>
     </w:p>
     <w:p>
@@ -4981,13 +4410,7 @@
         <w:rPr>
           <w:color w:val="000000"/>
         </w:rPr>
-        <w:t>Job Jenkins có tên student-cicd được tạo theo kiểu Pipeline from SCM: trỏ đến kho https://github.com/phuoctoan102334/DevOPS-26-13.git, nhánh */DanhTai, tệp kịch bản Jenkinsfile. Vì máy thực hành không có địa chỉ IP công khai nên không nhận webhook từ GitHub được; thay vào đó Jenkinsfile khai báo Poll SCM mỗi 2 phút một lần (H/2 * * * *). Token đăng nhập kho image GHCR được lưu trong Jenkins Credentials với ID ghcr-credentials và chỉ được truyền vào docker login qua --password-stdin để không lộ trong log. Bả</w:t>
-      </w:r>
-      <w:r>
-        <w:rPr>
-          <w:color w:val="000000"/>
-        </w:rPr>
-        <w:t>ng 4.5 mô tả vai trò của từng giai đoạn.</w:t>
+        <w:t>Job Jenkins có tên student-cicd được tạo theo kiểu Pipeline from SCM: trỏ đến kho https://github.com/phuoctoan102334/DevOPS-26-13.git, nhánh */DanhTai, tệp kịch bản Jenkinsfile. Vì máy thực hành không có địa chỉ IP công khai nên không nhận webhook từ GitHub được; thay vào đó Jenkinsfile khai báo Poll SCM mỗi 2 phút một lần (H/2 * * * *). Token đăng nhập kho image GHCR được lưu trong Jenkins Credentials với ID ghcr-credentials và chỉ được truyền vào docker login qua --password-stdin để không lộ trong log. Bảng 4.5 mô tả vai trò của từng giai đoạn.</w:t>
       </w:r>
     </w:p>
     <w:p>
@@ -5505,13 +4928,7 @@
         <w:pStyle w:val="u3"/>
       </w:pPr>
       <w:r>
-        <w:t>B. Jenkinsfile minh h</w:t>
-      </w:r>
-      <w:r>
-        <w:t>ọ</w:t>
-      </w:r>
-      <w:r>
-        <w:t>a</w:t>
+        <w:t>B. Jenkinsfile minh họa</w:t>
       </w:r>
     </w:p>
     <w:p>
@@ -5639,39 +5056,7 @@
           <w:color w:val="000000"/>
           <w:sz w:val="22"/>
         </w:rPr>
-        <w:t xml:space="preserve">    stage('Chu</w:t>
-      </w:r>
-      <w:r>
-        <w:rPr>
-          <w:rFonts w:ascii="Consolas" w:eastAsia="Consolas" w:hAnsi="Consolas"/>
-          <w:color w:val="000000"/>
-          <w:sz w:val="22"/>
-        </w:rPr>
-        <w:t>ẩ</w:t>
-      </w:r>
-      <w:r>
-        <w:rPr>
-          <w:rFonts w:ascii="Consolas" w:eastAsia="Consolas" w:hAnsi="Consolas"/>
-          <w:color w:val="000000"/>
-          <w:sz w:val="22"/>
-        </w:rPr>
-        <w:t>n b</w:t>
-      </w:r>
-      <w:r>
-        <w:rPr>
-          <w:rFonts w:ascii="Consolas" w:eastAsia="Consolas" w:hAnsi="Consolas"/>
-          <w:color w:val="000000"/>
-          <w:sz w:val="22"/>
-        </w:rPr>
-        <w:t>ị</w:t>
-      </w:r>
-      <w:r>
-        <w:rPr>
-          <w:rFonts w:ascii="Consolas" w:eastAsia="Consolas" w:hAnsi="Consolas"/>
-          <w:color w:val="000000"/>
-          <w:sz w:val="22"/>
-        </w:rPr>
-        <w:t>') {</w:t>
+        <w:t xml:space="preserve">    stage('Chuẩn bị') {</w:t>
       </w:r>
     </w:p>
     <w:p>
@@ -5791,23 +5176,7 @@
           <w:color w:val="000000"/>
           <w:sz w:val="22"/>
         </w:rPr>
-        <w:t xml:space="preserve">    stage('6. Ki</w:t>
-      </w:r>
-      <w:r>
-        <w:rPr>
-          <w:rFonts w:ascii="Consolas" w:eastAsia="Consolas" w:hAnsi="Consolas"/>
-          <w:color w:val="000000"/>
-          <w:sz w:val="22"/>
-        </w:rPr>
-        <w:t>ể</w:t>
-      </w:r>
-      <w:r>
-        <w:rPr>
-          <w:rFonts w:ascii="Consolas" w:eastAsia="Consolas" w:hAnsi="Consolas"/>
-          <w:color w:val="000000"/>
-          <w:sz w:val="22"/>
-        </w:rPr>
-        <w:t>m tra'){ steps { sh 'curl -sf http://host.docker.internal:8080/api/students' } }</w:t>
+        <w:t xml:space="preserve">    stage('6. Kiểm tra'){ steps { sh 'curl -sf http://host.docker.internal:8080/api/students' } }</w:t>
       </w:r>
     </w:p>
     <w:p>
@@ -5924,25 +5293,7 @@
         <w:pStyle w:val="u3"/>
       </w:pPr>
       <w:r>
-        <w:t>C. K</w:t>
-      </w:r>
-      <w:r>
-        <w:t>ế</w:t>
-      </w:r>
-      <w:r>
-        <w:t>t qu</w:t>
-      </w:r>
-      <w:r>
-        <w:t>ả</w:t>
-      </w:r>
-      <w:r>
-        <w:t xml:space="preserve"> ch</w:t>
-      </w:r>
-      <w:r>
-        <w:t>ạ</w:t>
-      </w:r>
-      <w:r>
-        <w:t>y pipeline</w:t>
+        <w:t>C. Kết quả chạy pipeline</w:t>
       </w:r>
     </w:p>
     <w:p>
@@ -5963,7 +5314,7 @@
           <w:noProof/>
         </w:rPr>
         <w:drawing>
-          <wp:inline distT="0" distB="0" distL="0" distR="0" wp14:anchorId="07433DBF" wp14:editId="39A48B99">
+          <wp:inline distT="0" distB="0" distL="0" distR="0" wp14:anchorId="0BAFFA8C" wp14:editId="792B7E16">
             <wp:extent cx="4680000" cy="2510625"/>
             <wp:effectExtent l="0" t="0" r="0" b="0"/>
             <wp:docPr id="7" name="Picture 7"/>
@@ -6005,11 +5356,11 @@
         <w:spacing w:after="160"/>
         <w:jc w:val="center"/>
       </w:pPr>
-      <w:bookmarkStart w:id="21" w:name="_Toc243091471"/>
+      <w:bookmarkStart w:id="19" w:name="_Toc243114687"/>
       <w:r>
         <w:t>Hình 4.6. Kết quả Build #4 của job student-cicd trên Jenkins</w:t>
       </w:r>
-      <w:bookmarkEnd w:id="21"/>
+      <w:bookmarkEnd w:id="19"/>
     </w:p>
     <w:p>
       <w:pPr>
@@ -6639,58 +5990,22 @@
       <w:pPr>
         <w:pStyle w:val="u1"/>
       </w:pPr>
-      <w:bookmarkStart w:id="22" w:name="_Toc243091460"/>
+      <w:bookmarkStart w:id="20" w:name="_Toc243114676"/>
       <w:r>
         <w:lastRenderedPageBreak/>
-        <w:t>CHƯƠNG 5. ĐÁNH GIÁ VÀ K</w:t>
+        <w:t>CHƯƠNG 5. ĐÁNH GIÁ VÀ KẾT LUẬN</w:t>
       </w:r>
-      <w:r>
-        <w:t>Ế</w:t>
-      </w:r>
-      <w:r>
-        <w:t>T LU</w:t>
-      </w:r>
-      <w:r>
-        <w:t>Ậ</w:t>
-      </w:r>
-      <w:r>
-        <w:t>N</w:t>
-      </w:r>
-      <w:bookmarkEnd w:id="22"/>
+      <w:bookmarkEnd w:id="20"/>
     </w:p>
     <w:p>
       <w:pPr>
         <w:pStyle w:val="u2"/>
       </w:pPr>
-      <w:bookmarkStart w:id="23" w:name="_Toc243091461"/>
+      <w:bookmarkStart w:id="21" w:name="_Toc243114677"/>
       <w:r>
-        <w:t>5.1. K</w:t>
+        <w:t>5.1. Kết quả đạt được</w:t>
       </w:r>
-      <w:r>
-        <w:t>ế</w:t>
-      </w:r>
-      <w:r>
-        <w:t>t qu</w:t>
-      </w:r>
-      <w:r>
-        <w:t>ả</w:t>
-      </w:r>
-      <w:r>
-        <w:t xml:space="preserve"> đ</w:t>
-      </w:r>
-      <w:r>
-        <w:t>ạ</w:t>
-      </w:r>
-      <w:r>
-        <w:t>t đư</w:t>
-      </w:r>
-      <w:r>
-        <w:t>ợ</w:t>
-      </w:r>
-      <w:r>
-        <w:t>c</w:t>
-      </w:r>
-      <w:bookmarkEnd w:id="23"/>
+      <w:bookmarkEnd w:id="21"/>
     </w:p>
     <w:p>
       <w:pPr>
@@ -7146,29 +6461,11 @@
       <w:pPr>
         <w:pStyle w:val="u2"/>
       </w:pPr>
-      <w:bookmarkStart w:id="24" w:name="_Toc243091462"/>
+      <w:bookmarkStart w:id="22" w:name="_Toc243114678"/>
       <w:r>
-        <w:t>5.2. M</w:t>
+        <w:t>5.2. Một số lưu ý và cách xử lý</w:t>
       </w:r>
-      <w:r>
-        <w:t>ộ</w:t>
-      </w:r>
-      <w:r>
-        <w:t>t s</w:t>
-      </w:r>
-      <w:r>
-        <w:t>ố</w:t>
-      </w:r>
-      <w:r>
-        <w:t xml:space="preserve"> lưu ý và cách x</w:t>
-      </w:r>
-      <w:r>
-        <w:t>ử</w:t>
-      </w:r>
-      <w:r>
-        <w:t xml:space="preserve"> lý</w:t>
-      </w:r>
-      <w:bookmarkEnd w:id="24"/>
+      <w:bookmarkEnd w:id="22"/>
     </w:p>
     <w:p>
       <w:pPr>
@@ -7283,23 +6580,11 @@
       <w:pPr>
         <w:pStyle w:val="u2"/>
       </w:pPr>
-      <w:bookmarkStart w:id="25" w:name="_Toc243091463"/>
+      <w:bookmarkStart w:id="23" w:name="_Toc243114679"/>
       <w:r>
-        <w:t>5.3. Hư</w:t>
+        <w:t>5.3. Hướng phát triển</w:t>
       </w:r>
-      <w:r>
-        <w:t>ớ</w:t>
-      </w:r>
-      <w:r>
-        <w:t>ng phát tri</w:t>
-      </w:r>
-      <w:r>
-        <w:t>ể</w:t>
-      </w:r>
-      <w:r>
-        <w:t>n</w:t>
-      </w:r>
-      <w:bookmarkEnd w:id="25"/>
+      <w:bookmarkEnd w:id="23"/>
     </w:p>
     <w:p>
       <w:pPr>
@@ -7371,23 +6656,11 @@
       <w:pPr>
         <w:pStyle w:val="u2"/>
       </w:pPr>
-      <w:bookmarkStart w:id="26" w:name="_Toc243091464"/>
+      <w:bookmarkStart w:id="24" w:name="_Toc243114680"/>
       <w:r>
-        <w:t>5.4. K</w:t>
+        <w:t>5.4. Kết luận</w:t>
       </w:r>
-      <w:r>
-        <w:t>ế</w:t>
-      </w:r>
-      <w:r>
-        <w:t>t lu</w:t>
-      </w:r>
-      <w:r>
-        <w:t>ậ</w:t>
-      </w:r>
-      <w:r>
-        <w:t>n</w:t>
-      </w:r>
-      <w:bookmarkEnd w:id="26"/>
+      <w:bookmarkEnd w:id="24"/>
     </w:p>
     <w:p>
       <w:r>
@@ -7409,24 +6682,12 @@
       <w:pPr>
         <w:pStyle w:val="u1"/>
       </w:pPr>
-      <w:bookmarkStart w:id="27" w:name="_Toc243091465"/>
+      <w:bookmarkStart w:id="25" w:name="_Toc243114681"/>
       <w:r>
         <w:lastRenderedPageBreak/>
-        <w:t>TÀI LI</w:t>
+        <w:t>TÀI LIỆU THAM KHẢO</w:t>
       </w:r>
-      <w:r>
-        <w:t>Ệ</w:t>
-      </w:r>
-      <w:r>
-        <w:t>U THAM KH</w:t>
-      </w:r>
-      <w:r>
-        <w:t>Ả</w:t>
-      </w:r>
-      <w:r>
-        <w:t>O</w:t>
-      </w:r>
-      <w:bookmarkEnd w:id="27"/>
+      <w:bookmarkEnd w:id="25"/>
     </w:p>
     <w:p>
       <w:pPr>
@@ -7443,12 +6704,7 @@
           <w:color w:val="000000"/>
         </w:rPr>
         <w:tab/>
-      </w:r>
-      <w:r>
-        <w:rPr>
-          <w:color w:val="000000"/>
-        </w:rPr>
-        <w:t>Microsoft, Windows Subsystem for Linux Documentation, https://learn.microsoft.com/windows/wsl/</w:t>
+        <w:t>Docker Inc., Docker Documentation, https://docs.docker.com/</w:t>
       </w:r>
     </w:p>
     <w:p>
@@ -7466,7 +6722,7 @@
           <w:color w:val="000000"/>
         </w:rPr>
         <w:tab/>
-        <w:t>OpenSSH Project, OpenSSH Manual Pages, https://www.openssh.com/manual.html</w:t>
+        <w:t>Docker Inc., Docker Compose Documentation, https://docs.docker.com/compose/</w:t>
       </w:r>
     </w:p>
     <w:p>
@@ -7484,7 +6740,7 @@
           <w:color w:val="000000"/>
         </w:rPr>
         <w:tab/>
-        <w:t>Docker Inc., Docker Documentation, https://docs.docker.com/</w:t>
+        <w:t>Docker Inc., Building with Buildx (multi-platform images), https://docs.docker.com/buildx/working-with-buildx/</w:t>
       </w:r>
     </w:p>
     <w:p>
@@ -7502,7 +6758,7 @@
           <w:color w:val="000000"/>
         </w:rPr>
         <w:tab/>
-        <w:t>Docker Inc., Docker Compose Documentation, https://docs.docker.com/compose/</w:t>
+        <w:t>Jenkins Project, Pipeline Syntax, https://www.jenkins.io/doc/book/pipeline/syntax/</w:t>
       </w:r>
     </w:p>
     <w:p>
@@ -7514,47 +6770,6 @@
           <w:color w:val="000000"/>
         </w:rPr>
         <w:t>[5]</w:t>
-      </w:r>
-      <w:r>
-        <w:rPr>
-          <w:color w:val="000000"/>
-        </w:rPr>
-        <w:tab/>
-        <w:t>Docker Inc., Building with Buildx (multi-platform images), https://docs.docker.com/buildx/working-with-buildx/</w:t>
-      </w:r>
-    </w:p>
-    <w:p>
-      <w:pPr>
-        <w:spacing w:after="40"/>
-      </w:pPr>
-      <w:r>
-        <w:rPr>
-          <w:color w:val="000000"/>
-        </w:rPr>
-        <w:t>[6]</w:t>
-      </w:r>
-      <w:r>
-        <w:rPr>
-          <w:color w:val="000000"/>
-        </w:rPr>
-        <w:tab/>
-      </w:r>
-      <w:r>
-        <w:rPr>
-          <w:color w:val="000000"/>
-        </w:rPr>
-        <w:t>Jenkins Project, Pipeline Syntax, https://www.jenkins.io/doc/book/pipeline/syntax/</w:t>
-      </w:r>
-    </w:p>
-    <w:p>
-      <w:pPr>
-        <w:spacing w:after="40"/>
-      </w:pPr>
-      <w:r>
-        <w:rPr>
-          <w:color w:val="000000"/>
-        </w:rPr>
-        <w:t>[7]</w:t>
       </w:r>
       <w:r>
         <w:rPr>
@@ -7900,31 +7115,31 @@
       </w:rPr>
     </w:lvl>
   </w:abstractNum>
-  <w:num w:numId="1" w16cid:durableId="852189588">
+  <w:num w:numId="1" w16cid:durableId="1756586657">
     <w:abstractNumId w:val="8"/>
   </w:num>
-  <w:num w:numId="2" w16cid:durableId="1509979062">
+  <w:num w:numId="2" w16cid:durableId="1688408237">
     <w:abstractNumId w:val="6"/>
   </w:num>
-  <w:num w:numId="3" w16cid:durableId="1234664406">
+  <w:num w:numId="3" w16cid:durableId="489909447">
     <w:abstractNumId w:val="5"/>
   </w:num>
-  <w:num w:numId="4" w16cid:durableId="1042100103">
+  <w:num w:numId="4" w16cid:durableId="467549327">
     <w:abstractNumId w:val="4"/>
   </w:num>
-  <w:num w:numId="5" w16cid:durableId="1500464604">
+  <w:num w:numId="5" w16cid:durableId="220482520">
     <w:abstractNumId w:val="7"/>
   </w:num>
-  <w:num w:numId="6" w16cid:durableId="1242254218">
+  <w:num w:numId="6" w16cid:durableId="102507150">
     <w:abstractNumId w:val="3"/>
   </w:num>
-  <w:num w:numId="7" w16cid:durableId="505022927">
+  <w:num w:numId="7" w16cid:durableId="1766071458">
     <w:abstractNumId w:val="2"/>
   </w:num>
-  <w:num w:numId="8" w16cid:durableId="338384680">
+  <w:num w:numId="8" w16cid:durableId="71395694">
     <w:abstractNumId w:val="1"/>
   </w:num>
-  <w:num w:numId="9" w16cid:durableId="1277106140">
+  <w:num w:numId="9" w16cid:durableId="1206452519">
     <w:abstractNumId w:val="0"/>
   </w:num>
 </w:numbering>
@@ -19326,21 +18541,10 @@
     <w:autoRedefine/>
     <w:uiPriority w:val="39"/>
     <w:unhideWhenUsed/>
-    <w:rsid w:val="00317CD1"/>
+    <w:rsid w:val="005F0CA0"/>
     <w:pPr>
       <w:spacing w:after="100"/>
     </w:pPr>
-  </w:style>
-  <w:style w:type="character" w:styleId="Siuktni">
-    <w:name w:val="Hyperlink"/>
-    <w:basedOn w:val="Phngmcinhcuaoanvn"/>
-    <w:uiPriority w:val="99"/>
-    <w:unhideWhenUsed/>
-    <w:rsid w:val="00317CD1"/>
-    <w:rPr>
-      <w:color w:val="0000FF" w:themeColor="hyperlink"/>
-      <w:u w:val="single"/>
-    </w:rPr>
   </w:style>
   <w:style w:type="paragraph" w:styleId="Mucluc2">
     <w:name w:val="toc 2"/>
@@ -19349,11 +18553,22 @@
     <w:autoRedefine/>
     <w:uiPriority w:val="39"/>
     <w:unhideWhenUsed/>
-    <w:rsid w:val="00317CD1"/>
+    <w:rsid w:val="005F0CA0"/>
     <w:pPr>
       <w:spacing w:after="100"/>
       <w:ind w:left="260"/>
     </w:pPr>
+  </w:style>
+  <w:style w:type="character" w:styleId="Siuktni">
+    <w:name w:val="Hyperlink"/>
+    <w:basedOn w:val="Phngmcinhcuaoanvn"/>
+    <w:uiPriority w:val="99"/>
+    <w:unhideWhenUsed/>
+    <w:rsid w:val="005F0CA0"/>
+    <w:rPr>
+      <w:color w:val="0000FF" w:themeColor="hyperlink"/>
+      <w:u w:val="single"/>
+    </w:rPr>
   </w:style>
 </w:styles>
 </file>

</xml_diff>